<commit_message>
Check if sources file is read
</commit_message>
<xml_diff>
--- a/DesignRef.docx
+++ b/DesignRef.docx
@@ -6441,12 +6441,20 @@
       <w:pPr>
         <w:jc w:val="right"/>
         <w:rPr>
-          <w:rtl/>
-          <w:lang w:val="en-US"/>
-        </w:rPr>
-      </w:pPr>
-      <w:r>
-        <w:rPr>
+          <w:b/>
+          <w:bCs/>
+          <w:sz w:val="28"/>
+          <w:szCs w:val="28"/>
+          <w:rtl/>
+          <w:lang w:val="en-US"/>
+        </w:rPr>
+      </w:pPr>
+      <w:r>
+        <w:rPr>
+          <w:b/>
+          <w:bCs/>
+          <w:sz w:val="28"/>
+          <w:szCs w:val="28"/>
           <w:lang w:val="en-US"/>
         </w:rPr>
         <w:lastRenderedPageBreak/>
@@ -6455,11 +6463,2525 @@
     </w:p>
     <w:p>
       <w:pPr>
-        <w:jc w:val="right"/>
-        <w:rPr>
-          <w:rFonts w:hint="cs"/>
-          <w:rtl/>
-          <w:lang w:val="en-US"/>
+        <w:bidi/>
+        <w:rPr>
+          <w:b/>
+          <w:bCs/>
+          <w:sz w:val="28"/>
+          <w:szCs w:val="28"/>
+          <w:rtl/>
+          <w:lang w:val="en-US"/>
+        </w:rPr>
+      </w:pPr>
+      <w:r>
+        <w:rPr>
+          <w:rFonts w:hint="cs"/>
+          <w:b/>
+          <w:bCs/>
+          <w:sz w:val="28"/>
+          <w:szCs w:val="28"/>
+          <w:rtl/>
+          <w:lang w:val="en-US"/>
+        </w:rPr>
+        <w:t>פיתוח גרסה חדשה לאפליקציה :</w:t>
+      </w:r>
+      <w:r>
+        <w:rPr>
+          <w:b/>
+          <w:bCs/>
+          <w:sz w:val="28"/>
+          <w:szCs w:val="28"/>
+          <w:lang w:val="en-US"/>
+        </w:rPr>
+        <w:t xml:space="preserve"> </w:t>
+      </w:r>
+    </w:p>
+    <w:p>
+      <w:pPr>
+        <w:bidi/>
+        <w:rPr>
+          <w:rtl/>
+          <w:lang w:val="en-US"/>
+        </w:rPr>
+      </w:pPr>
+      <w:r>
+        <w:rPr>
+          <w:rFonts w:hint="cs"/>
+          <w:rtl/>
+          <w:lang w:val="en-US"/>
+        </w:rPr>
+        <w:t xml:space="preserve">ניהול </w:t>
+      </w:r>
+      <w:proofErr w:type="spellStart"/>
+      <w:r>
+        <w:rPr>
+          <w:rFonts w:hint="cs"/>
+          <w:rtl/>
+          <w:lang w:val="en-US"/>
+        </w:rPr>
+        <w:t>גירסאות</w:t>
+      </w:r>
+      <w:proofErr w:type="spellEnd"/>
+      <w:r>
+        <w:rPr>
+          <w:rFonts w:hint="cs"/>
+          <w:rtl/>
+          <w:lang w:val="en-US"/>
+        </w:rPr>
+        <w:t xml:space="preserve"> : </w:t>
+      </w:r>
+    </w:p>
+    <w:p>
+      <w:pPr>
+        <w:bidi/>
+        <w:rPr>
+          <w:rtl/>
+          <w:lang w:val="en-US"/>
+        </w:rPr>
+      </w:pPr>
+      <w:r>
+        <w:rPr>
+          <w:rFonts w:hint="cs"/>
+          <w:rtl/>
+          <w:lang w:val="en-US"/>
+        </w:rPr>
+        <w:t xml:space="preserve">פיתוח </w:t>
+      </w:r>
+      <w:proofErr w:type="spellStart"/>
+      <w:r>
+        <w:rPr>
+          <w:rFonts w:hint="cs"/>
+          <w:rtl/>
+          <w:lang w:val="en-US"/>
+        </w:rPr>
+        <w:t>גירסה</w:t>
+      </w:r>
+      <w:proofErr w:type="spellEnd"/>
+      <w:r>
+        <w:rPr>
+          <w:rFonts w:hint="cs"/>
+          <w:rtl/>
+          <w:lang w:val="en-US"/>
+        </w:rPr>
+        <w:t xml:space="preserve"> בשילוב עם </w:t>
+      </w:r>
+      <w:proofErr w:type="spellStart"/>
+      <w:r>
+        <w:rPr>
+          <w:lang w:val="en-US"/>
+        </w:rPr>
+        <w:t>github</w:t>
+      </w:r>
+      <w:proofErr w:type="spellEnd"/>
+      <w:r>
+        <w:rPr>
+          <w:lang w:val="en-US"/>
+        </w:rPr>
+        <w:t xml:space="preserve"> </w:t>
+      </w:r>
+      <w:r>
+        <w:rPr>
+          <w:rFonts w:hint="cs"/>
+          <w:rtl/>
+          <w:lang w:val="en-US"/>
+        </w:rPr>
+        <w:t xml:space="preserve">  וניהול </w:t>
+      </w:r>
+      <w:r>
+        <w:rPr>
+          <w:lang w:val="en-US"/>
+        </w:rPr>
+        <w:t xml:space="preserve">Deployment </w:t>
+      </w:r>
+      <w:r>
+        <w:rPr>
+          <w:rFonts w:hint="cs"/>
+          <w:rtl/>
+          <w:lang w:val="en-US"/>
+        </w:rPr>
+        <w:t>:</w:t>
+      </w:r>
+      <w:r>
+        <w:rPr>
+          <w:lang w:val="en-US"/>
+        </w:rPr>
+        <w:t xml:space="preserve">  </w:t>
+      </w:r>
+    </w:p>
+    <w:p>
+      <w:pPr>
+        <w:bidi/>
+        <w:rPr>
+          <w:lang w:val="en-IL"/>
+        </w:rPr>
+      </w:pPr>
+      <w:r>
+        <w:rPr>
+          <w:rtl/>
+          <w:lang w:val="en-US"/>
+        </w:rPr>
+        <w:t xml:space="preserve">השיטה שאתה מחפש נקראת </w:t>
+      </w:r>
+      <w:r>
+        <w:rPr>
+          <w:b/>
+          <w:bCs/>
+          <w:lang w:val="en-IL"/>
+        </w:rPr>
+        <w:t>Feature Branching</w:t>
+      </w:r>
+      <w:r>
+        <w:rPr>
+          <w:lang w:val="en-IL"/>
+        </w:rPr>
+        <w:t>:</w:t>
+      </w:r>
+    </w:p>
+    <w:p>
+      <w:pPr>
+        <w:numPr>
+          <w:ilvl w:val="0"/>
+          <w:numId w:val="7"/>
+        </w:numPr>
+        <w:bidi/>
+        <w:rPr>
+          <w:lang w:val="en-IL"/>
+        </w:rPr>
+      </w:pPr>
+      <w:r>
+        <w:rPr>
+          <w:rtl/>
+          <w:lang w:val="en-US"/>
+        </w:rPr>
+        <w:t>שומרים את הקוד שעובד בענף הראשי</w:t>
+      </w:r>
+      <w:r>
+        <w:rPr>
+          <w:lang w:val="en-IL"/>
+        </w:rPr>
+        <w:t xml:space="preserve"> (main).</w:t>
+      </w:r>
+    </w:p>
+    <w:p>
+      <w:pPr>
+        <w:numPr>
+          <w:ilvl w:val="0"/>
+          <w:numId w:val="7"/>
+        </w:numPr>
+        <w:bidi/>
+        <w:rPr>
+          <w:lang w:val="en-IL"/>
+        </w:rPr>
+      </w:pPr>
+      <w:r>
+        <w:rPr>
+          <w:rtl/>
+          <w:lang w:val="en-US"/>
+        </w:rPr>
+        <w:t>עובדים על השינויים בענף נפרד</w:t>
+      </w:r>
+      <w:r>
+        <w:rPr>
+          <w:lang w:val="en-IL"/>
+        </w:rPr>
+        <w:t xml:space="preserve"> (dev </w:t>
+      </w:r>
+      <w:r>
+        <w:rPr>
+          <w:rtl/>
+          <w:lang w:val="en-US"/>
+        </w:rPr>
+        <w:t xml:space="preserve">או </w:t>
+      </w:r>
+      <w:r>
+        <w:rPr>
+          <w:lang w:val="en-IL"/>
+        </w:rPr>
+        <w:t>version-1.1).</w:t>
+      </w:r>
+    </w:p>
+    <w:p>
+      <w:pPr>
+        <w:numPr>
+          <w:ilvl w:val="0"/>
+          <w:numId w:val="7"/>
+        </w:numPr>
+        <w:bidi/>
+        <w:rPr>
+          <w:lang w:val="en-IL"/>
+        </w:rPr>
+      </w:pPr>
+      <w:r>
+        <w:rPr>
+          <w:rtl/>
+          <w:lang w:val="en-US"/>
+        </w:rPr>
+        <w:t>מבצעים את ה</w:t>
+      </w:r>
+      <w:r>
+        <w:rPr>
+          <w:lang w:val="en-IL"/>
+        </w:rPr>
+        <w:t xml:space="preserve">-Deployment </w:t>
+      </w:r>
+      <w:r>
+        <w:rPr>
+          <w:rtl/>
+          <w:lang w:val="en-US"/>
+        </w:rPr>
+        <w:t>רק כשמאחדים את הענפים</w:t>
+      </w:r>
+      <w:r>
+        <w:rPr>
+          <w:lang w:val="en-IL"/>
+        </w:rPr>
+        <w:t>.</w:t>
+      </w:r>
+    </w:p>
+    <w:p>
+      <w:pPr>
+        <w:bidi/>
+        <w:rPr>
+          <w:lang w:val="en-IL"/>
+        </w:rPr>
+      </w:pPr>
+      <w:r>
+        <w:rPr>
+          <w:rtl/>
+          <w:lang w:val="en-US"/>
+        </w:rPr>
+        <w:t>הנה המדריך המעשי לביצוע</w:t>
+      </w:r>
+      <w:r>
+        <w:rPr>
+          <w:lang w:val="en-IL"/>
+        </w:rPr>
+        <w:t>:</w:t>
+      </w:r>
+    </w:p>
+    <w:p>
+      <w:pPr>
+        <w:bidi/>
+        <w:rPr>
+          <w:lang w:val="en-IL"/>
+        </w:rPr>
+      </w:pPr>
+      <w:r>
+        <w:rPr>
+          <w:lang w:val="en-IL"/>
+        </w:rPr>
+        <w:pict w14:anchorId="3501BDEF">
+          <v:rect id="_x0000_i1091" style="width:0;height:1.5pt" o:hralign="center" o:hrstd="t" o:hr="t" fillcolor="#a0a0a0" stroked="f"/>
+        </w:pict>
+      </w:r>
+    </w:p>
+    <w:p>
+      <w:pPr>
+        <w:bidi/>
+        <w:rPr>
+          <w:b/>
+          <w:bCs/>
+          <w:lang w:val="en-IL"/>
+        </w:rPr>
+      </w:pPr>
+      <w:r>
+        <w:rPr>
+          <w:b/>
+          <w:bCs/>
+          <w:lang w:val="en-IL"/>
+        </w:rPr>
+        <w:t xml:space="preserve">1. </w:t>
+      </w:r>
+      <w:r>
+        <w:rPr>
+          <w:b/>
+          <w:bCs/>
+          <w:rtl/>
+          <w:lang w:val="en-US"/>
+        </w:rPr>
+        <w:t>שמירת המצב הקיים ("הקפאת מצב")</w:t>
+      </w:r>
+    </w:p>
+    <w:p>
+      <w:pPr>
+        <w:bidi/>
+        <w:rPr>
+          <w:lang w:val="en-IL"/>
+        </w:rPr>
+      </w:pPr>
+      <w:r>
+        <w:rPr>
+          <w:rtl/>
+          <w:lang w:val="en-US"/>
+        </w:rPr>
+        <w:t>לפני שנוגעים בקוד, בוא נוודא שהגרסה הנוכחית (היציבה) שמורה ומסומנת ב</w:t>
+      </w:r>
+      <w:r>
+        <w:rPr>
+          <w:lang w:val="en-IL"/>
+        </w:rPr>
+        <w:t xml:space="preserve">-GitHub. </w:t>
+      </w:r>
+      <w:r>
+        <w:rPr>
+          <w:rtl/>
+          <w:lang w:val="en-US"/>
+        </w:rPr>
+        <w:t>פתח את הטרמינל ב</w:t>
+      </w:r>
+      <w:r>
+        <w:rPr>
+          <w:lang w:val="en-IL"/>
+        </w:rPr>
+        <w:t xml:space="preserve">-VS Code </w:t>
+      </w:r>
+      <w:r>
+        <w:rPr>
+          <w:rtl/>
+          <w:lang w:val="en-US"/>
+        </w:rPr>
+        <w:t>והרץ</w:t>
+      </w:r>
+      <w:r>
+        <w:rPr>
+          <w:lang w:val="en-IL"/>
+        </w:rPr>
+        <w:t>:</w:t>
+      </w:r>
+    </w:p>
+    <w:p>
+      <w:pPr>
+        <w:bidi/>
+      </w:pPr>
+      <w:r>
+        <w:rPr>
+          <w:rtl/>
+          <w:lang w:val="en-IL"/>
+        </w:rPr>
+        <w:t>השלבים לניהול גרסאות, יצירת ענף פיתוח</w:t>
+      </w:r>
+      <w:r>
+        <w:t xml:space="preserve"> (dev) </w:t>
+      </w:r>
+      <w:r>
+        <w:rPr>
+          <w:rtl/>
+          <w:lang w:val="en-IL"/>
+        </w:rPr>
+        <w:t>וביצוע</w:t>
+      </w:r>
+      <w:r>
+        <w:t xml:space="preserve"> Deployment </w:t>
+      </w:r>
+      <w:r>
+        <w:rPr>
+          <w:rtl/>
+          <w:lang w:val="en-IL"/>
+        </w:rPr>
+        <w:t>רק כשמוכנים</w:t>
+      </w:r>
+      <w:r>
+        <w:t>:</w:t>
+      </w:r>
+    </w:p>
+    <w:p>
+      <w:pPr>
+        <w:bidi/>
+      </w:pPr>
+    </w:p>
+    <w:p>
+      <w:pPr>
+        <w:bidi/>
+        <w:rPr>
+          <w:b/>
+          <w:bCs/>
+          <w:lang w:val="en-IL"/>
+        </w:rPr>
+      </w:pPr>
+      <w:r>
+        <w:rPr>
+          <w:b/>
+          <w:bCs/>
+          <w:rtl/>
+          <w:lang w:val="en-US"/>
+        </w:rPr>
+        <w:t>שלב 1: יצירת ענף פיתוח</w:t>
+      </w:r>
+      <w:r>
+        <w:rPr>
+          <w:b/>
+          <w:bCs/>
+          <w:lang w:val="en-IL"/>
+        </w:rPr>
+        <w:t xml:space="preserve"> (dev)</w:t>
+      </w:r>
+    </w:p>
+    <w:p>
+      <w:pPr>
+        <w:bidi/>
+        <w:rPr>
+          <w:lang w:val="en-IL"/>
+        </w:rPr>
+      </w:pPr>
+      <w:r>
+        <w:rPr>
+          <w:rtl/>
+          <w:lang w:val="en-US"/>
+        </w:rPr>
+        <w:t>אנחנו רוצים להפריד את הקוד היציב מהניסויים החדשים עם ה</w:t>
+      </w:r>
+      <w:r>
+        <w:rPr>
+          <w:lang w:val="en-IL"/>
+        </w:rPr>
+        <w:t>-AI.</w:t>
+      </w:r>
+    </w:p>
+    <w:p>
+      <w:pPr>
+        <w:numPr>
+          <w:ilvl w:val="0"/>
+          <w:numId w:val="8"/>
+        </w:numPr>
+        <w:bidi/>
+        <w:rPr>
+          <w:lang w:val="en-IL"/>
+        </w:rPr>
+      </w:pPr>
+      <w:r>
+        <w:rPr>
+          <w:rtl/>
+          <w:lang w:val="en-US"/>
+        </w:rPr>
+        <w:t>בפינה השמאלית התחתונה של</w:t>
+      </w:r>
+      <w:r>
+        <w:rPr>
+          <w:lang w:val="en-IL"/>
+        </w:rPr>
+        <w:t xml:space="preserve"> VS Code, </w:t>
+      </w:r>
+      <w:r>
+        <w:rPr>
+          <w:rtl/>
+          <w:lang w:val="en-US"/>
+        </w:rPr>
+        <w:t xml:space="preserve">לחץ על המילה </w:t>
+      </w:r>
+      <w:r>
+        <w:rPr>
+          <w:b/>
+          <w:bCs/>
+          <w:lang w:val="en-IL"/>
+        </w:rPr>
+        <w:t>main</w:t>
+      </w:r>
+      <w:r>
+        <w:rPr>
+          <w:lang w:val="en-IL"/>
+        </w:rPr>
+        <w:t>.</w:t>
+      </w:r>
+    </w:p>
+    <w:p>
+      <w:pPr>
+        <w:numPr>
+          <w:ilvl w:val="0"/>
+          <w:numId w:val="8"/>
+        </w:numPr>
+        <w:bidi/>
+        <w:rPr>
+          <w:lang w:val="en-IL"/>
+        </w:rPr>
+      </w:pPr>
+      <w:r>
+        <w:rPr>
+          <w:rtl/>
+          <w:lang w:val="en-US"/>
+        </w:rPr>
+        <w:t>בתיבת הטקסט שתיפתח למעלה, בחר ב</w:t>
+      </w:r>
+      <w:r>
+        <w:rPr>
+          <w:lang w:val="en-IL"/>
+        </w:rPr>
+        <w:t>-</w:t>
+      </w:r>
+      <w:r>
+        <w:rPr>
+          <w:b/>
+          <w:bCs/>
+          <w:lang w:val="en-IL"/>
+        </w:rPr>
+        <w:t>+ Create new branch...</w:t>
+      </w:r>
+      <w:r>
+        <w:rPr>
+          <w:lang w:val="en-IL"/>
+        </w:rPr>
+        <w:t>.</w:t>
+      </w:r>
+    </w:p>
+    <w:p>
+      <w:pPr>
+        <w:numPr>
+          <w:ilvl w:val="0"/>
+          <w:numId w:val="8"/>
+        </w:numPr>
+        <w:bidi/>
+        <w:rPr>
+          <w:lang w:val="en-IL"/>
+        </w:rPr>
+      </w:pPr>
+      <w:r>
+        <w:rPr>
+          <w:rtl/>
+          <w:lang w:val="en-US"/>
+        </w:rPr>
+        <w:t xml:space="preserve">הקלד את השם </w:t>
+      </w:r>
+      <w:r>
+        <w:rPr>
+          <w:b/>
+          <w:bCs/>
+          <w:lang w:val="en-IL"/>
+        </w:rPr>
+        <w:t>dev</w:t>
+      </w:r>
+      <w:r>
+        <w:rPr>
+          <w:lang w:val="en-IL"/>
+        </w:rPr>
+        <w:t xml:space="preserve"> </w:t>
+      </w:r>
+      <w:r>
+        <w:rPr>
+          <w:rtl/>
+          <w:lang w:val="en-US"/>
+        </w:rPr>
+        <w:t>ולחץ</w:t>
+      </w:r>
+      <w:r>
+        <w:rPr>
+          <w:lang w:val="en-IL"/>
+        </w:rPr>
+        <w:t xml:space="preserve"> Enter.</w:t>
+      </w:r>
+    </w:p>
+    <w:p>
+      <w:pPr>
+        <w:numPr>
+          <w:ilvl w:val="1"/>
+          <w:numId w:val="8"/>
+        </w:numPr>
+        <w:bidi/>
+        <w:rPr>
+          <w:lang w:val="en-IL"/>
+        </w:rPr>
+      </w:pPr>
+      <w:r>
+        <w:rPr>
+          <w:i/>
+          <w:iCs/>
+          <w:rtl/>
+          <w:lang w:val="en-US"/>
+        </w:rPr>
+        <w:t>עכשיו אתה נמצא ב"סביבת עבודה בטוחה". כל שינוי שתעשה לא ישפיע על האתר החי</w:t>
+      </w:r>
+      <w:r>
+        <w:rPr>
+          <w:i/>
+          <w:iCs/>
+          <w:lang w:val="en-IL"/>
+        </w:rPr>
+        <w:t>.</w:t>
+      </w:r>
+    </w:p>
+    <w:p>
+      <w:pPr>
+        <w:bidi/>
+        <w:rPr>
+          <w:b/>
+          <w:bCs/>
+          <w:lang w:val="en-IL"/>
+        </w:rPr>
+      </w:pPr>
+      <w:r>
+        <w:rPr>
+          <w:b/>
+          <w:bCs/>
+          <w:rtl/>
+          <w:lang w:val="en-IL"/>
+        </w:rPr>
+        <w:t>שלב 2: הכנסת השינויים (הקוד הדינמי)</w:t>
+      </w:r>
+    </w:p>
+    <w:p>
+      <w:pPr>
+        <w:bidi/>
+        <w:rPr>
+          <w:lang w:val="en-IL"/>
+        </w:rPr>
+      </w:pPr>
+      <w:r>
+        <w:rPr>
+          <w:rtl/>
+          <w:lang w:val="en-IL"/>
+        </w:rPr>
+        <w:t xml:space="preserve">עכשיו בצע את השינויים שדיברנו עליהם (עדכון </w:t>
+      </w:r>
+      <w:proofErr w:type="spellStart"/>
+      <w:r>
+        <w:rPr>
+          <w:lang w:val="en-IL"/>
+        </w:rPr>
+        <w:t>api</w:t>
+      </w:r>
+      <w:proofErr w:type="spellEnd"/>
+      <w:r>
+        <w:rPr>
+          <w:lang w:val="en-IL"/>
+        </w:rPr>
+        <w:t xml:space="preserve">/server.js </w:t>
+      </w:r>
+      <w:r>
+        <w:rPr>
+          <w:rtl/>
+          <w:lang w:val="en-IL"/>
+        </w:rPr>
+        <w:t xml:space="preserve">לקריאת </w:t>
+      </w:r>
+      <w:r>
+        <w:rPr>
+          <w:lang w:val="en-IL"/>
+        </w:rPr>
+        <w:t>sources.txt).</w:t>
+      </w:r>
+    </w:p>
+    <w:p>
+      <w:pPr>
+        <w:numPr>
+          <w:ilvl w:val="0"/>
+          <w:numId w:val="9"/>
+        </w:numPr>
+        <w:bidi/>
+        <w:rPr>
+          <w:lang w:val="en-IL"/>
+        </w:rPr>
+      </w:pPr>
+      <w:r>
+        <w:rPr>
+          <w:rtl/>
+          <w:lang w:val="en-IL"/>
+        </w:rPr>
+        <w:t>עדכן את הקבצים ב</w:t>
+      </w:r>
+      <w:r>
+        <w:rPr>
+          <w:lang w:val="en-IL"/>
+        </w:rPr>
+        <w:t>-VS Code.</w:t>
+      </w:r>
+    </w:p>
+    <w:p>
+      <w:pPr>
+        <w:numPr>
+          <w:ilvl w:val="0"/>
+          <w:numId w:val="9"/>
+        </w:numPr>
+        <w:bidi/>
+        <w:rPr>
+          <w:lang w:val="en-IL"/>
+        </w:rPr>
+      </w:pPr>
+      <w:r>
+        <w:rPr>
+          <w:rtl/>
+          <w:lang w:val="en-IL"/>
+        </w:rPr>
+        <w:t xml:space="preserve">לחץ על האייקון של </w:t>
+      </w:r>
+      <w:r>
+        <w:rPr>
+          <w:b/>
+          <w:bCs/>
+          <w:lang w:val="en-IL"/>
+        </w:rPr>
+        <w:t>Source Control</w:t>
+      </w:r>
+      <w:r>
+        <w:rPr>
+          <w:lang w:val="en-IL"/>
+        </w:rPr>
+        <w:t xml:space="preserve"> </w:t>
+      </w:r>
+      <w:r>
+        <w:rPr>
+          <w:rtl/>
+          <w:lang w:val="en-IL"/>
+        </w:rPr>
+        <w:t>בתפריט הצד (האייקון עם העיגול והקווים, בדרך כלל השלישי מלמעלה)</w:t>
+      </w:r>
+      <w:r>
+        <w:rPr>
+          <w:lang w:val="en-IL"/>
+        </w:rPr>
+        <w:t>.</w:t>
+      </w:r>
+    </w:p>
+    <w:p>
+      <w:pPr>
+        <w:numPr>
+          <w:ilvl w:val="0"/>
+          <w:numId w:val="9"/>
+        </w:numPr>
+        <w:bidi/>
+        <w:rPr>
+          <w:lang w:val="en-IL"/>
+        </w:rPr>
+      </w:pPr>
+      <w:r>
+        <w:rPr>
+          <w:rtl/>
+          <w:lang w:val="en-IL"/>
+        </w:rPr>
+        <w:t xml:space="preserve">תחת הכותרת </w:t>
+      </w:r>
+      <w:r>
+        <w:rPr>
+          <w:b/>
+          <w:bCs/>
+          <w:lang w:val="en-IL"/>
+        </w:rPr>
+        <w:t>Changes</w:t>
+      </w:r>
+      <w:r>
+        <w:rPr>
+          <w:lang w:val="en-IL"/>
+        </w:rPr>
+        <w:t xml:space="preserve">, </w:t>
+      </w:r>
+      <w:r>
+        <w:rPr>
+          <w:rtl/>
+          <w:lang w:val="en-IL"/>
+        </w:rPr>
+        <w:t>תראה את הקבצים ששינית</w:t>
+      </w:r>
+      <w:r>
+        <w:rPr>
+          <w:lang w:val="en-IL"/>
+        </w:rPr>
+        <w:t>.</w:t>
+      </w:r>
+    </w:p>
+    <w:p>
+      <w:pPr>
+        <w:bidi/>
+        <w:rPr>
+          <w:lang w:val="en-IL"/>
+        </w:rPr>
+      </w:pPr>
+    </w:p>
+    <w:p>
+      <w:pPr>
+        <w:bidi/>
+        <w:rPr>
+          <w:lang w:val="en-IL"/>
+        </w:rPr>
+      </w:pPr>
+    </w:p>
+    <w:p>
+      <w:pPr>
+        <w:numPr>
+          <w:ilvl w:val="0"/>
+          <w:numId w:val="9"/>
+        </w:numPr>
+        <w:bidi/>
+        <w:rPr>
+          <w:lang w:val="en-IL"/>
+        </w:rPr>
+      </w:pPr>
+      <w:r>
+        <w:rPr>
+          <w:rtl/>
+          <w:lang w:val="en-IL"/>
+        </w:rPr>
+        <w:t>לחץ על ה</w:t>
+      </w:r>
+      <w:r>
+        <w:rPr>
+          <w:lang w:val="en-IL"/>
+        </w:rPr>
+        <w:t>-</w:t>
+      </w:r>
+      <w:r>
+        <w:rPr>
+          <w:b/>
+          <w:bCs/>
+          <w:lang w:val="en-IL"/>
+        </w:rPr>
+        <w:t>+</w:t>
+      </w:r>
+      <w:r>
+        <w:rPr>
+          <w:lang w:val="en-IL"/>
+        </w:rPr>
+        <w:t xml:space="preserve"> </w:t>
+      </w:r>
+      <w:r>
+        <w:rPr>
+          <w:rtl/>
+          <w:lang w:val="en-IL"/>
+        </w:rPr>
+        <w:t>ליד כל קובץ</w:t>
+      </w:r>
+      <w:r>
+        <w:rPr>
+          <w:lang w:val="en-IL"/>
+        </w:rPr>
+        <w:t xml:space="preserve"> (</w:t>
+      </w:r>
+      <w:r>
+        <w:rPr>
+          <w:rtl/>
+          <w:lang w:val="en-IL"/>
+        </w:rPr>
+        <w:t>או ליד הכותרת</w:t>
+      </w:r>
+      <w:r>
+        <w:rPr>
+          <w:lang w:val="en-IL"/>
+        </w:rPr>
+        <w:t xml:space="preserve"> Changes) </w:t>
+      </w:r>
+      <w:r>
+        <w:rPr>
+          <w:rtl/>
+          <w:lang w:val="en-IL"/>
+        </w:rPr>
+        <w:t>כדי להעביר אותם ל</w:t>
+      </w:r>
+      <w:r>
+        <w:rPr>
+          <w:lang w:val="en-IL"/>
+        </w:rPr>
+        <w:t>-</w:t>
+      </w:r>
+      <w:r>
+        <w:rPr>
+          <w:b/>
+          <w:bCs/>
+          <w:lang w:val="en-IL"/>
+        </w:rPr>
+        <w:t>Staged Changes</w:t>
+      </w:r>
+      <w:r>
+        <w:rPr>
+          <w:lang w:val="en-IL"/>
+        </w:rPr>
+        <w:t>.</w:t>
+      </w:r>
+    </w:p>
+    <w:p>
+      <w:pPr>
+        <w:numPr>
+          <w:ilvl w:val="0"/>
+          <w:numId w:val="9"/>
+        </w:numPr>
+        <w:bidi/>
+        <w:rPr>
+          <w:lang w:val="en-IL"/>
+        </w:rPr>
+      </w:pPr>
+      <w:r>
+        <w:rPr>
+          <w:rtl/>
+          <w:lang w:val="en-IL"/>
+        </w:rPr>
+        <w:t>בתיבת ה</w:t>
+      </w:r>
+      <w:r>
+        <w:rPr>
+          <w:lang w:val="en-IL"/>
+        </w:rPr>
+        <w:t xml:space="preserve">-Message </w:t>
+      </w:r>
+      <w:r>
+        <w:rPr>
+          <w:rtl/>
+          <w:lang w:val="en-IL"/>
+        </w:rPr>
+        <w:t>למעלה, כתוב</w:t>
+      </w:r>
+      <w:r>
+        <w:rPr>
+          <w:lang w:val="en-IL"/>
+        </w:rPr>
+        <w:t>: Upgrade to dynamic AI sources.</w:t>
+      </w:r>
+    </w:p>
+    <w:p>
+      <w:pPr>
+        <w:numPr>
+          <w:ilvl w:val="0"/>
+          <w:numId w:val="9"/>
+        </w:numPr>
+        <w:bidi/>
+        <w:rPr>
+          <w:lang w:val="en-IL"/>
+        </w:rPr>
+      </w:pPr>
+      <w:r>
+        <w:rPr>
+          <w:rtl/>
+          <w:lang w:val="en-IL"/>
+        </w:rPr>
+        <w:t>לחץ על כפתור ה</w:t>
+      </w:r>
+      <w:r>
+        <w:rPr>
+          <w:lang w:val="en-IL"/>
+        </w:rPr>
+        <w:t>-</w:t>
+      </w:r>
+      <w:r>
+        <w:rPr>
+          <w:b/>
+          <w:bCs/>
+          <w:lang w:val="en-IL"/>
+        </w:rPr>
+        <w:t>Commit</w:t>
+      </w:r>
+      <w:r>
+        <w:rPr>
+          <w:lang w:val="en-IL"/>
+        </w:rPr>
+        <w:t>.</w:t>
+      </w:r>
+    </w:p>
+    <w:p>
+      <w:pPr>
+        <w:numPr>
+          <w:ilvl w:val="0"/>
+          <w:numId w:val="9"/>
+        </w:numPr>
+        <w:bidi/>
+        <w:rPr>
+          <w:lang w:val="en-IL"/>
+        </w:rPr>
+      </w:pPr>
+      <w:r>
+        <w:rPr>
+          <w:rtl/>
+          <w:lang w:val="en-IL"/>
+        </w:rPr>
+        <w:t>לחץ על כפתור ה</w:t>
+      </w:r>
+      <w:r>
+        <w:rPr>
+          <w:lang w:val="en-IL"/>
+        </w:rPr>
+        <w:t>-</w:t>
+      </w:r>
+      <w:r>
+        <w:rPr>
+          <w:b/>
+          <w:bCs/>
+          <w:lang w:val="en-IL"/>
+        </w:rPr>
+        <w:t>Publish Branch</w:t>
+      </w:r>
+      <w:r>
+        <w:rPr>
+          <w:lang w:val="en-IL"/>
+        </w:rPr>
+        <w:t xml:space="preserve"> </w:t>
+      </w:r>
+      <w:r>
+        <w:rPr>
+          <w:rtl/>
+          <w:lang w:val="en-IL"/>
+        </w:rPr>
+        <w:t>(הכפתור הכחול שיופיע) כדי לשלוח את הענף ל</w:t>
+      </w:r>
+      <w:r>
+        <w:rPr>
+          <w:lang w:val="en-IL"/>
+        </w:rPr>
+        <w:t>-GitHub.</w:t>
+      </w:r>
+    </w:p>
+    <w:p>
+      <w:pPr>
+        <w:bidi/>
+        <w:rPr>
+          <w:lang w:val="en-IL"/>
+        </w:rPr>
+      </w:pPr>
+      <w:r>
+        <w:rPr>
+          <w:lang w:val="en-IL"/>
+        </w:rPr>
+        <w:pict w14:anchorId="119217D7">
+          <v:rect id="_x0000_i1111" style="width:0;height:1.5pt" o:hralign="center" o:hrstd="t" o:hr="t" fillcolor="#a0a0a0" stroked="f"/>
+        </w:pict>
+      </w:r>
+    </w:p>
+    <w:p>
+      <w:pPr>
+        <w:bidi/>
+        <w:rPr>
+          <w:b/>
+          <w:bCs/>
+          <w:lang w:val="en-IL"/>
+        </w:rPr>
+      </w:pPr>
+      <w:r>
+        <w:rPr>
+          <w:b/>
+          <w:bCs/>
+          <w:rtl/>
+          <w:lang w:val="en-IL"/>
+        </w:rPr>
+        <w:t>שלב 3: בדיקת ה</w:t>
+      </w:r>
+      <w:r>
+        <w:rPr>
+          <w:b/>
+          <w:bCs/>
+          <w:lang w:val="en-IL"/>
+        </w:rPr>
+        <w:t xml:space="preserve">-Preview </w:t>
+      </w:r>
+      <w:r>
+        <w:rPr>
+          <w:b/>
+          <w:bCs/>
+          <w:rtl/>
+          <w:lang w:val="en-IL"/>
+        </w:rPr>
+        <w:t>ב</w:t>
+      </w:r>
+      <w:r>
+        <w:rPr>
+          <w:b/>
+          <w:bCs/>
+          <w:lang w:val="en-IL"/>
+        </w:rPr>
+        <w:t>-</w:t>
+      </w:r>
+      <w:proofErr w:type="spellStart"/>
+      <w:r>
+        <w:rPr>
+          <w:b/>
+          <w:bCs/>
+          <w:lang w:val="en-IL"/>
+        </w:rPr>
+        <w:t>Vercel</w:t>
+      </w:r>
+      <w:proofErr w:type="spellEnd"/>
+    </w:p>
+    <w:p>
+      <w:pPr>
+        <w:bidi/>
+        <w:rPr>
+          <w:lang w:val="en-IL"/>
+        </w:rPr>
+      </w:pPr>
+      <w:r>
+        <w:rPr>
+          <w:rtl/>
+          <w:lang w:val="en-IL"/>
+        </w:rPr>
+        <w:t>לאחר ה</w:t>
+      </w:r>
+      <w:r>
+        <w:rPr>
+          <w:lang w:val="en-IL"/>
+        </w:rPr>
+        <w:t xml:space="preserve">-Publish, </w:t>
+      </w:r>
+      <w:r>
+        <w:rPr>
+          <w:rtl/>
+          <w:lang w:val="en-IL"/>
+        </w:rPr>
+        <w:t>ה</w:t>
+      </w:r>
+      <w:r>
+        <w:rPr>
+          <w:lang w:val="en-IL"/>
+        </w:rPr>
+        <w:t xml:space="preserve">-Deployment </w:t>
+      </w:r>
+      <w:r>
+        <w:rPr>
+          <w:rtl/>
+          <w:lang w:val="en-IL"/>
+        </w:rPr>
+        <w:t>האוטומטי של</w:t>
+      </w:r>
+      <w:r>
+        <w:rPr>
+          <w:lang w:val="en-IL"/>
+        </w:rPr>
+        <w:t xml:space="preserve"> </w:t>
+      </w:r>
+      <w:proofErr w:type="spellStart"/>
+      <w:r>
+        <w:rPr>
+          <w:lang w:val="en-IL"/>
+        </w:rPr>
+        <w:t>Vercel</w:t>
+      </w:r>
+      <w:proofErr w:type="spellEnd"/>
+      <w:r>
+        <w:rPr>
+          <w:lang w:val="en-IL"/>
+        </w:rPr>
+        <w:t xml:space="preserve"> </w:t>
+      </w:r>
+      <w:r>
+        <w:rPr>
+          <w:rtl/>
+          <w:lang w:val="en-IL"/>
+        </w:rPr>
+        <w:t xml:space="preserve">יתחיל </w:t>
+      </w:r>
+      <w:r>
+        <w:rPr>
+          <w:b/>
+          <w:bCs/>
+          <w:rtl/>
+          <w:lang w:val="en-IL"/>
+        </w:rPr>
+        <w:t>רק עבור הענף הזה</w:t>
+      </w:r>
+      <w:r>
+        <w:rPr>
+          <w:lang w:val="en-IL"/>
+        </w:rPr>
+        <w:t>.</w:t>
+      </w:r>
+    </w:p>
+    <w:p>
+      <w:pPr>
+        <w:numPr>
+          <w:ilvl w:val="0"/>
+          <w:numId w:val="10"/>
+        </w:numPr>
+        <w:bidi/>
+        <w:rPr>
+          <w:lang w:val="en-IL"/>
+        </w:rPr>
+      </w:pPr>
+      <w:r>
+        <w:rPr>
+          <w:rtl/>
+          <w:lang w:val="en-IL"/>
+        </w:rPr>
+        <w:t xml:space="preserve">כנס לאתר של </w:t>
+      </w:r>
+      <w:proofErr w:type="spellStart"/>
+      <w:r>
+        <w:rPr>
+          <w:b/>
+          <w:bCs/>
+          <w:lang w:val="en-IL"/>
+        </w:rPr>
+        <w:t>Vercel</w:t>
+      </w:r>
+      <w:proofErr w:type="spellEnd"/>
+      <w:r>
+        <w:rPr>
+          <w:b/>
+          <w:bCs/>
+          <w:lang w:val="en-IL"/>
+        </w:rPr>
+        <w:t xml:space="preserve"> Dashboard</w:t>
+      </w:r>
+      <w:r>
+        <w:rPr>
+          <w:lang w:val="en-IL"/>
+        </w:rPr>
+        <w:t>.</w:t>
+      </w:r>
+    </w:p>
+    <w:p>
+      <w:pPr>
+        <w:numPr>
+          <w:ilvl w:val="0"/>
+          <w:numId w:val="10"/>
+        </w:numPr>
+        <w:bidi/>
+        <w:rPr>
+          <w:lang w:val="en-IL"/>
+        </w:rPr>
+      </w:pPr>
+      <w:r>
+        <w:rPr>
+          <w:rtl/>
+          <w:lang w:val="en-IL"/>
+        </w:rPr>
+        <w:t xml:space="preserve">תראה שם פרויקט חדש תחת הכותרת </w:t>
+      </w:r>
+      <w:r>
+        <w:rPr>
+          <w:b/>
+          <w:bCs/>
+          <w:lang w:val="en-IL"/>
+        </w:rPr>
+        <w:t>Preview</w:t>
+      </w:r>
+      <w:r>
+        <w:rPr>
+          <w:lang w:val="en-IL"/>
+        </w:rPr>
+        <w:t>.</w:t>
+      </w:r>
+    </w:p>
+    <w:p>
+      <w:pPr>
+        <w:numPr>
+          <w:ilvl w:val="0"/>
+          <w:numId w:val="10"/>
+        </w:numPr>
+        <w:bidi/>
+        <w:rPr>
+          <w:lang w:val="en-IL"/>
+        </w:rPr>
+      </w:pPr>
+      <w:r>
+        <w:rPr>
+          <w:rtl/>
+          <w:lang w:val="en-IL"/>
+        </w:rPr>
+        <w:t>לחץ על הקישור שלו (זה לא הכתובת הרגילה שלך, אלא כתובת זמנית)</w:t>
+      </w:r>
+      <w:r>
+        <w:rPr>
+          <w:lang w:val="en-IL"/>
+        </w:rPr>
+        <w:t>.</w:t>
+      </w:r>
+    </w:p>
+    <w:p>
+      <w:pPr>
+        <w:numPr>
+          <w:ilvl w:val="0"/>
+          <w:numId w:val="10"/>
+        </w:numPr>
+        <w:bidi/>
+        <w:rPr>
+          <w:lang w:val="en-IL"/>
+        </w:rPr>
+      </w:pPr>
+      <w:r>
+        <w:rPr>
+          <w:b/>
+          <w:bCs/>
+          <w:rtl/>
+          <w:lang w:val="en-IL"/>
+        </w:rPr>
+        <w:t xml:space="preserve">בדוק </w:t>
+      </w:r>
+      <w:proofErr w:type="spellStart"/>
+      <w:r>
+        <w:rPr>
+          <w:b/>
+          <w:bCs/>
+          <w:rtl/>
+          <w:lang w:val="en-IL"/>
+        </w:rPr>
+        <w:t>שהכל</w:t>
+      </w:r>
+      <w:proofErr w:type="spellEnd"/>
+      <w:r>
+        <w:rPr>
+          <w:b/>
+          <w:bCs/>
+          <w:rtl/>
+          <w:lang w:val="en-IL"/>
+        </w:rPr>
+        <w:t xml:space="preserve"> עובד</w:t>
+      </w:r>
+      <w:r>
+        <w:rPr>
+          <w:b/>
+          <w:bCs/>
+          <w:lang w:val="en-IL"/>
+        </w:rPr>
+        <w:t>:</w:t>
+      </w:r>
+      <w:r>
+        <w:rPr>
+          <w:lang w:val="en-IL"/>
+        </w:rPr>
+        <w:t xml:space="preserve"> </w:t>
+      </w:r>
+      <w:r>
+        <w:rPr>
+          <w:rtl/>
+          <w:lang w:val="en-IL"/>
+        </w:rPr>
+        <w:t>שהתפריט עולה ושאין שגיאות</w:t>
+      </w:r>
+      <w:r>
+        <w:rPr>
+          <w:lang w:val="en-IL"/>
+        </w:rPr>
+        <w:t>.</w:t>
+      </w:r>
+    </w:p>
+    <w:p>
+      <w:pPr>
+        <w:bidi/>
+        <w:rPr>
+          <w:lang w:val="en-IL"/>
+        </w:rPr>
+      </w:pPr>
+      <w:r>
+        <w:rPr>
+          <w:lang w:val="en-IL"/>
+        </w:rPr>
+        <w:pict w14:anchorId="2CA93E7E">
+          <v:rect id="_x0000_i1112" style="width:0;height:1.5pt" o:hralign="center" o:hrstd="t" o:hr="t" fillcolor="#a0a0a0" stroked="f"/>
+        </w:pict>
+      </w:r>
+    </w:p>
+    <w:p>
+      <w:pPr>
+        <w:bidi/>
+        <w:rPr>
+          <w:b/>
+          <w:bCs/>
+          <w:lang w:val="en-IL"/>
+        </w:rPr>
+      </w:pPr>
+      <w:r>
+        <w:rPr>
+          <w:b/>
+          <w:bCs/>
+          <w:rtl/>
+          <w:lang w:val="en-IL"/>
+        </w:rPr>
+        <w:t>שלב 4: המיזוג</w:t>
+      </w:r>
+      <w:r>
+        <w:rPr>
+          <w:b/>
+          <w:bCs/>
+          <w:lang w:val="en-IL"/>
+        </w:rPr>
+        <w:t xml:space="preserve"> (Deployment </w:t>
+      </w:r>
+      <w:r>
+        <w:rPr>
+          <w:b/>
+          <w:bCs/>
+          <w:rtl/>
+          <w:lang w:val="en-IL"/>
+        </w:rPr>
+        <w:t>לאתר החי</w:t>
+      </w:r>
+      <w:r>
+        <w:rPr>
+          <w:b/>
+          <w:bCs/>
+          <w:lang w:val="en-IL"/>
+        </w:rPr>
+        <w:t>)</w:t>
+      </w:r>
+    </w:p>
+    <w:p>
+      <w:pPr>
+        <w:bidi/>
+        <w:rPr>
+          <w:lang w:val="en-IL"/>
+        </w:rPr>
+      </w:pPr>
+      <w:r>
+        <w:rPr>
+          <w:rtl/>
+          <w:lang w:val="en-IL"/>
+        </w:rPr>
+        <w:t>רק כשאתה מרוצה מהתוצאה בקישור ה</w:t>
+      </w:r>
+      <w:r>
+        <w:rPr>
+          <w:lang w:val="en-IL"/>
+        </w:rPr>
+        <w:t xml:space="preserve">-Preview, </w:t>
+      </w:r>
+      <w:r>
+        <w:rPr>
+          <w:rtl/>
+          <w:lang w:val="en-IL"/>
+        </w:rPr>
+        <w:t>נחזיר את השינויים ל</w:t>
+      </w:r>
+      <w:r>
+        <w:rPr>
+          <w:lang w:val="en-IL"/>
+        </w:rPr>
+        <w:t>-main.</w:t>
+      </w:r>
+    </w:p>
+    <w:p>
+      <w:pPr>
+        <w:numPr>
+          <w:ilvl w:val="0"/>
+          <w:numId w:val="11"/>
+        </w:numPr>
+        <w:bidi/>
+        <w:rPr>
+          <w:lang w:val="en-IL"/>
+        </w:rPr>
+      </w:pPr>
+      <w:r>
+        <w:rPr>
+          <w:rtl/>
+          <w:lang w:val="en-IL"/>
+        </w:rPr>
+        <w:t xml:space="preserve">לחץ שוב בפינה השמאלית התחתונה על המילה </w:t>
+      </w:r>
+      <w:r>
+        <w:rPr>
+          <w:b/>
+          <w:bCs/>
+          <w:lang w:val="en-IL"/>
+        </w:rPr>
+        <w:t>dev</w:t>
+      </w:r>
+      <w:r>
+        <w:rPr>
+          <w:lang w:val="en-IL"/>
+        </w:rPr>
+        <w:t>.</w:t>
+      </w:r>
+    </w:p>
+    <w:p>
+      <w:pPr>
+        <w:numPr>
+          <w:ilvl w:val="0"/>
+          <w:numId w:val="11"/>
+        </w:numPr>
+        <w:bidi/>
+        <w:rPr>
+          <w:lang w:val="en-IL"/>
+        </w:rPr>
+      </w:pPr>
+      <w:r>
+        <w:rPr>
+          <w:rtl/>
+          <w:lang w:val="en-IL"/>
+        </w:rPr>
+        <w:t xml:space="preserve">בחר ברשימה את הענף </w:t>
+      </w:r>
+      <w:r>
+        <w:rPr>
+          <w:b/>
+          <w:bCs/>
+          <w:lang w:val="en-IL"/>
+        </w:rPr>
+        <w:t>main</w:t>
+      </w:r>
+      <w:r>
+        <w:rPr>
+          <w:lang w:val="en-IL"/>
+        </w:rPr>
+        <w:t xml:space="preserve"> (</w:t>
+      </w:r>
+      <w:r>
+        <w:rPr>
+          <w:rtl/>
+          <w:lang w:val="en-IL"/>
+        </w:rPr>
+        <w:t>כדי לחזור אליו</w:t>
+      </w:r>
+      <w:r>
+        <w:rPr>
+          <w:lang w:val="en-IL"/>
+        </w:rPr>
+        <w:t>).</w:t>
+      </w:r>
+    </w:p>
+    <w:p>
+      <w:pPr>
+        <w:numPr>
+          <w:ilvl w:val="0"/>
+          <w:numId w:val="11"/>
+        </w:numPr>
+        <w:bidi/>
+        <w:rPr>
+          <w:lang w:val="en-IL"/>
+        </w:rPr>
+      </w:pPr>
+      <w:r>
+        <w:rPr>
+          <w:rtl/>
+          <w:lang w:val="en-IL"/>
+        </w:rPr>
+        <w:t>לחץ על ה</w:t>
+      </w:r>
+      <w:r>
+        <w:rPr>
+          <w:lang w:val="en-IL"/>
+        </w:rPr>
+        <w:t>-</w:t>
+      </w:r>
+      <w:r>
+        <w:rPr>
+          <w:b/>
+          <w:bCs/>
+          <w:lang w:val="en-IL"/>
+        </w:rPr>
+        <w:t xml:space="preserve">3 </w:t>
+      </w:r>
+      <w:r>
+        <w:rPr>
+          <w:b/>
+          <w:bCs/>
+          <w:rtl/>
+          <w:lang w:val="en-IL"/>
+        </w:rPr>
+        <w:t>נקודות</w:t>
+      </w:r>
+      <w:r>
+        <w:rPr>
+          <w:b/>
+          <w:bCs/>
+          <w:lang w:val="en-IL"/>
+        </w:rPr>
+        <w:t xml:space="preserve"> (...)</w:t>
+      </w:r>
+      <w:r>
+        <w:rPr>
+          <w:lang w:val="en-IL"/>
+        </w:rPr>
+        <w:t xml:space="preserve"> </w:t>
+      </w:r>
+      <w:r>
+        <w:rPr>
+          <w:rtl/>
+          <w:lang w:val="en-IL"/>
+        </w:rPr>
+        <w:t>בראש תפריט ה</w:t>
+      </w:r>
+      <w:r>
+        <w:rPr>
+          <w:lang w:val="en-IL"/>
+        </w:rPr>
+        <w:t>-Source Control (</w:t>
+      </w:r>
+      <w:r>
+        <w:rPr>
+          <w:rtl/>
+          <w:lang w:val="en-IL"/>
+        </w:rPr>
+        <w:t>ליד המילה</w:t>
+      </w:r>
+      <w:r>
+        <w:rPr>
+          <w:lang w:val="en-IL"/>
+        </w:rPr>
+        <w:t xml:space="preserve"> Source Control).</w:t>
+      </w:r>
+    </w:p>
+    <w:p>
+      <w:pPr>
+        <w:numPr>
+          <w:ilvl w:val="0"/>
+          <w:numId w:val="11"/>
+        </w:numPr>
+        <w:bidi/>
+        <w:rPr>
+          <w:lang w:val="en-IL"/>
+        </w:rPr>
+      </w:pPr>
+      <w:r>
+        <w:rPr>
+          <w:rtl/>
+          <w:lang w:val="en-IL"/>
+        </w:rPr>
+        <w:t>בחר בתפריט ב</w:t>
+      </w:r>
+      <w:r>
+        <w:rPr>
+          <w:lang w:val="en-IL"/>
+        </w:rPr>
+        <w:t>-</w:t>
+      </w:r>
+      <w:r>
+        <w:rPr>
+          <w:b/>
+          <w:bCs/>
+          <w:lang w:val="en-IL"/>
+        </w:rPr>
+        <w:t>Branch</w:t>
+      </w:r>
+      <w:r>
+        <w:rPr>
+          <w:lang w:val="en-IL"/>
+        </w:rPr>
+        <w:t xml:space="preserve"> </w:t>
+      </w:r>
+      <w:r>
+        <w:rPr>
+          <w:rtl/>
+          <w:lang w:val="en-IL"/>
+        </w:rPr>
+        <w:t>ואז ב</w:t>
+      </w:r>
+      <w:r>
+        <w:rPr>
+          <w:lang w:val="en-IL"/>
+        </w:rPr>
+        <w:t>-</w:t>
+      </w:r>
+      <w:r>
+        <w:rPr>
+          <w:b/>
+          <w:bCs/>
+          <w:lang w:val="en-IL"/>
+        </w:rPr>
+        <w:t>Merge Branch...</w:t>
+      </w:r>
+      <w:r>
+        <w:rPr>
+          <w:lang w:val="en-IL"/>
+        </w:rPr>
+        <w:t>.</w:t>
+      </w:r>
+    </w:p>
+    <w:p>
+      <w:pPr>
+        <w:numPr>
+          <w:ilvl w:val="0"/>
+          <w:numId w:val="11"/>
+        </w:numPr>
+        <w:bidi/>
+        <w:rPr>
+          <w:lang w:val="en-IL"/>
+        </w:rPr>
+      </w:pPr>
+      <w:r>
+        <w:rPr>
+          <w:rtl/>
+          <w:lang w:val="en-IL"/>
+        </w:rPr>
+        <w:t xml:space="preserve">בחר ברשימה את הענף </w:t>
+      </w:r>
+      <w:r>
+        <w:rPr>
+          <w:b/>
+          <w:bCs/>
+          <w:lang w:val="en-IL"/>
+        </w:rPr>
+        <w:t>dev</w:t>
+      </w:r>
+      <w:r>
+        <w:rPr>
+          <w:lang w:val="en-IL"/>
+        </w:rPr>
+        <w:t>.</w:t>
+      </w:r>
+    </w:p>
+    <w:p>
+      <w:pPr>
+        <w:numPr>
+          <w:ilvl w:val="0"/>
+          <w:numId w:val="11"/>
+        </w:numPr>
+        <w:bidi/>
+        <w:rPr>
+          <w:lang w:val="en-IL"/>
+        </w:rPr>
+      </w:pPr>
+      <w:r>
+        <w:rPr>
+          <w:lang w:val="en-IL"/>
+        </w:rPr>
+        <w:t xml:space="preserve">VS Code </w:t>
+      </w:r>
+      <w:r>
+        <w:rPr>
+          <w:rtl/>
+          <w:lang w:val="en-IL"/>
+        </w:rPr>
+        <w:t>ימזג את השינויים לתוך ה</w:t>
+      </w:r>
+      <w:r>
+        <w:rPr>
+          <w:lang w:val="en-IL"/>
+        </w:rPr>
+        <w:t xml:space="preserve">-main </w:t>
+      </w:r>
+      <w:r>
+        <w:rPr>
+          <w:rtl/>
+          <w:lang w:val="en-IL"/>
+        </w:rPr>
+        <w:t>המקומי שלך</w:t>
+      </w:r>
+      <w:r>
+        <w:rPr>
+          <w:lang w:val="en-IL"/>
+        </w:rPr>
+        <w:t>.</w:t>
+      </w:r>
+    </w:p>
+    <w:p>
+      <w:pPr>
+        <w:numPr>
+          <w:ilvl w:val="0"/>
+          <w:numId w:val="11"/>
+        </w:numPr>
+        <w:bidi/>
+        <w:rPr>
+          <w:lang w:val="en-IL"/>
+        </w:rPr>
+      </w:pPr>
+      <w:r>
+        <w:rPr>
+          <w:rtl/>
+          <w:lang w:val="en-IL"/>
+        </w:rPr>
+        <w:t xml:space="preserve">לחץ על </w:t>
+      </w:r>
+      <w:r>
+        <w:rPr>
+          <w:b/>
+          <w:bCs/>
+          <w:lang w:val="en-IL"/>
+        </w:rPr>
+        <w:t>Sync Changes</w:t>
+      </w:r>
+      <w:r>
+        <w:rPr>
+          <w:lang w:val="en-IL"/>
+        </w:rPr>
+        <w:t xml:space="preserve"> </w:t>
+      </w:r>
+      <w:r>
+        <w:rPr>
+          <w:rtl/>
+          <w:lang w:val="en-IL"/>
+        </w:rPr>
+        <w:t>(הכפתור הכחול עם האייקון של החיצים) כדי לעדכן את</w:t>
+      </w:r>
+      <w:r>
+        <w:rPr>
+          <w:lang w:val="en-IL"/>
+        </w:rPr>
+        <w:t xml:space="preserve"> GitHub.</w:t>
+      </w:r>
+    </w:p>
+    <w:p>
+      <w:pPr>
+        <w:bidi/>
+        <w:rPr>
+          <w:lang w:val="en-IL"/>
+        </w:rPr>
+      </w:pPr>
+      <w:r>
+        <w:rPr>
+          <w:lang w:val="en-IL"/>
+        </w:rPr>
+        <w:pict w14:anchorId="73CF21C4">
+          <v:rect id="_x0000_i1113" style="width:0;height:1.5pt" o:hralign="center" o:hrstd="t" o:hr="t" fillcolor="#a0a0a0" stroked="f"/>
+        </w:pict>
+      </w:r>
+    </w:p>
+    <w:p>
+      <w:pPr>
+        <w:bidi/>
+        <w:rPr>
+          <w:b/>
+          <w:bCs/>
+          <w:lang w:val="en-IL"/>
+        </w:rPr>
+      </w:pPr>
+      <w:r>
+        <w:rPr>
+          <w:b/>
+          <w:bCs/>
+          <w:rtl/>
+          <w:lang w:val="en-IL"/>
+        </w:rPr>
+        <w:t>איך תראה את הגרסה בכותרת</w:t>
+      </w:r>
+      <w:r>
+        <w:rPr>
+          <w:b/>
+          <w:bCs/>
+          <w:lang w:val="en-IL"/>
+        </w:rPr>
+        <w:t>?</w:t>
+      </w:r>
+    </w:p>
+    <w:p>
+      <w:pPr>
+        <w:bidi/>
+        <w:rPr>
+          <w:lang w:val="en-IL"/>
+        </w:rPr>
+      </w:pPr>
+      <w:r>
+        <w:rPr>
+          <w:rtl/>
+          <w:lang w:val="en-IL"/>
+        </w:rPr>
+        <w:t>כדי שזה יקרה, פשוט תוודא שבקובץ ה</w:t>
+      </w:r>
+      <w:r>
+        <w:rPr>
+          <w:lang w:val="en-IL"/>
+        </w:rPr>
+        <w:t xml:space="preserve">-index.html </w:t>
+      </w:r>
+      <w:r>
+        <w:rPr>
+          <w:rtl/>
+          <w:lang w:val="en-IL"/>
+        </w:rPr>
+        <w:t>החדש ששמנו בענף ה</w:t>
+      </w:r>
+      <w:r>
+        <w:rPr>
+          <w:lang w:val="en-IL"/>
+        </w:rPr>
+        <w:t xml:space="preserve">-dev, </w:t>
+      </w:r>
+      <w:r>
+        <w:rPr>
+          <w:rtl/>
+          <w:lang w:val="en-IL"/>
+        </w:rPr>
+        <w:t>הכותרת נראית כך</w:t>
+      </w:r>
+      <w:r>
+        <w:rPr>
+          <w:lang w:val="en-IL"/>
+        </w:rPr>
+        <w:t>:</w:t>
+      </w:r>
+    </w:p>
+    <w:p>
+      <w:pPr>
+        <w:bidi/>
+        <w:rPr>
+          <w:lang w:val="en-IL"/>
+        </w:rPr>
+      </w:pPr>
+    </w:p>
+    <w:p>
+      <w:pPr>
+        <w:bidi/>
+        <w:rPr>
+          <w:lang w:val="en-IL"/>
+        </w:rPr>
+      </w:pPr>
+    </w:p>
+    <w:p>
+      <w:pPr>
+        <w:bidi/>
+        <w:rPr>
+          <w:lang w:val="en-IL"/>
+        </w:rPr>
+      </w:pPr>
+    </w:p>
+    <w:p>
+      <w:pPr>
+        <w:bidi/>
+        <w:rPr>
+          <w:lang w:val="en-IL"/>
+        </w:rPr>
+      </w:pPr>
+    </w:p>
+    <w:p>
+      <w:pPr>
+        <w:bidi/>
+        <w:rPr>
+          <w:lang w:val="en-IL"/>
+        </w:rPr>
+      </w:pPr>
+    </w:p>
+    <w:p>
+      <w:pPr>
+        <w:bidi/>
+        <w:rPr>
+          <w:lang w:val="en-IL"/>
+        </w:rPr>
+      </w:pPr>
+    </w:p>
+    <w:p>
+      <w:pPr>
+        <w:bidi/>
+        <w:rPr>
+          <w:rtl/>
+          <w:lang w:val="en-IL"/>
+        </w:rPr>
+      </w:pPr>
+      <w:r>
+        <w:rPr>
+          <w:rFonts w:hint="cs"/>
+          <w:rtl/>
+          <w:lang w:val="en-IL"/>
+        </w:rPr>
+        <w:t xml:space="preserve"> </w:t>
+      </w:r>
+      <w:proofErr w:type="spellStart"/>
+      <w:r>
+        <w:rPr>
+          <w:rFonts w:hint="cs"/>
+          <w:rtl/>
+          <w:lang w:val="en-IL"/>
+        </w:rPr>
+        <w:t>איפיון</w:t>
+      </w:r>
+      <w:proofErr w:type="spellEnd"/>
+      <w:r>
+        <w:rPr>
+          <w:rFonts w:hint="cs"/>
+          <w:rtl/>
+          <w:lang w:val="en-IL"/>
+        </w:rPr>
+        <w:t xml:space="preserve">  </w:t>
+      </w:r>
+      <w:proofErr w:type="spellStart"/>
+      <w:r>
+        <w:rPr>
+          <w:rFonts w:hint="cs"/>
+          <w:rtl/>
+          <w:lang w:val="en-IL"/>
+        </w:rPr>
+        <w:t>הגירסה</w:t>
+      </w:r>
+      <w:proofErr w:type="spellEnd"/>
+      <w:r>
+        <w:rPr>
+          <w:rFonts w:hint="cs"/>
+          <w:rtl/>
+          <w:lang w:val="en-IL"/>
+        </w:rPr>
+        <w:t xml:space="preserve"> החדשה :</w:t>
+      </w:r>
+      <w:r>
+        <w:rPr>
+          <w:lang w:val="en-IL"/>
+        </w:rPr>
+        <w:t xml:space="preserve"> </w:t>
+      </w:r>
+    </w:p>
+    <w:p>
+      <w:pPr>
+        <w:bidi/>
+        <w:rPr>
+          <w:lang w:val="en-IL"/>
+        </w:rPr>
+      </w:pPr>
+      <w:r>
+        <w:rPr>
+          <w:b/>
+          <w:bCs/>
+          <w:rtl/>
+          <w:lang w:val="en-IL"/>
+        </w:rPr>
+        <w:t>אוטומציה מלאה</w:t>
+      </w:r>
+      <w:r>
+        <w:rPr>
+          <w:rtl/>
+          <w:lang w:val="en-IL"/>
+        </w:rPr>
+        <w:t xml:space="preserve"> </w:t>
+      </w:r>
+      <w:r>
+        <w:rPr>
+          <w:lang w:val="en-IL"/>
+        </w:rPr>
+        <w:t xml:space="preserve">– </w:t>
+      </w:r>
+      <w:r>
+        <w:rPr>
+          <w:rtl/>
+          <w:lang w:val="en-IL"/>
+        </w:rPr>
+        <w:t xml:space="preserve"> </w:t>
+      </w:r>
+      <w:r>
+        <w:rPr>
+          <w:rFonts w:hint="cs"/>
+          <w:rtl/>
+          <w:lang w:val="en-IL"/>
+        </w:rPr>
+        <w:t xml:space="preserve">אני </w:t>
+      </w:r>
+      <w:r>
+        <w:rPr>
+          <w:rtl/>
+          <w:lang w:val="en-IL"/>
+        </w:rPr>
+        <w:t>מעלה קובץ טקסט פשוט (המאגר) ל</w:t>
+      </w:r>
+      <w:r>
+        <w:rPr>
+          <w:lang w:val="en-IL"/>
+        </w:rPr>
+        <w:t xml:space="preserve">-GitHub, </w:t>
+      </w:r>
+      <w:r>
+        <w:rPr>
+          <w:rtl/>
+          <w:lang w:val="en-IL"/>
+        </w:rPr>
+        <w:t>והאפליקציה כבר יודעת לבד לקחת את הטקסט הזה, "להבין" אותו בעזרת ה</w:t>
+      </w:r>
+      <w:r>
+        <w:rPr>
+          <w:lang w:val="en-IL"/>
+        </w:rPr>
+        <w:t xml:space="preserve">-AI, </w:t>
+      </w:r>
+      <w:r>
+        <w:rPr>
+          <w:rtl/>
+          <w:lang w:val="en-IL"/>
+        </w:rPr>
+        <w:t>ולהפוך אותו לתפריט שמוצג למשתמש</w:t>
+      </w:r>
+      <w:r>
+        <w:rPr>
+          <w:lang w:val="en-IL"/>
+        </w:rPr>
+        <w:t>.</w:t>
+      </w:r>
+    </w:p>
+    <w:p>
+      <w:pPr>
+        <w:bidi/>
+        <w:rPr>
+          <w:lang w:val="en-IL"/>
+        </w:rPr>
+      </w:pPr>
+      <w:r>
+        <w:rPr>
+          <w:rtl/>
+          <w:lang w:val="en-IL"/>
+        </w:rPr>
+        <w:t xml:space="preserve">בצורה הזו, </w:t>
+      </w:r>
+      <w:r>
+        <w:rPr>
+          <w:rFonts w:hint="cs"/>
+          <w:rtl/>
+          <w:lang w:val="en-IL"/>
+        </w:rPr>
+        <w:t xml:space="preserve"> אני </w:t>
+      </w:r>
+      <w:r>
+        <w:rPr>
+          <w:rtl/>
+          <w:lang w:val="en-IL"/>
+        </w:rPr>
+        <w:t xml:space="preserve"> לא צריך להעתיק</w:t>
+      </w:r>
+      <w:r>
+        <w:rPr>
+          <w:lang w:val="en-IL"/>
+        </w:rPr>
+        <w:t xml:space="preserve"> JSON </w:t>
+      </w:r>
+      <w:r>
+        <w:rPr>
+          <w:rtl/>
+          <w:lang w:val="en-IL"/>
+        </w:rPr>
+        <w:t>לצ'אט ולא צריך להיות "עורך תוכן</w:t>
+      </w:r>
+      <w:r>
+        <w:rPr>
+          <w:lang w:val="en-IL"/>
+        </w:rPr>
+        <w:t>".</w:t>
+      </w:r>
+    </w:p>
+    <w:p>
+      <w:pPr>
+        <w:bidi/>
+        <w:rPr>
+          <w:lang w:val="en-IL"/>
+        </w:rPr>
+      </w:pPr>
+      <w:r>
+        <w:rPr>
+          <w:rtl/>
+          <w:lang w:val="en-IL"/>
+        </w:rPr>
+        <w:t xml:space="preserve"> הדרך לבצע זאת טכנית בתוך המגבלות של</w:t>
+      </w:r>
+      <w:r>
+        <w:rPr>
+          <w:lang w:val="en-IL"/>
+        </w:rPr>
+        <w:t xml:space="preserve"> </w:t>
+      </w:r>
+      <w:proofErr w:type="spellStart"/>
+      <w:r>
+        <w:rPr>
+          <w:lang w:val="en-IL"/>
+        </w:rPr>
+        <w:t>Vercel</w:t>
+      </w:r>
+      <w:proofErr w:type="spellEnd"/>
+      <w:r>
+        <w:rPr>
+          <w:lang w:val="en-IL"/>
+        </w:rPr>
+        <w:t>:</w:t>
+      </w:r>
+    </w:p>
+    <w:p>
+      <w:pPr>
+        <w:bidi/>
+        <w:rPr>
+          <w:b/>
+          <w:bCs/>
+          <w:lang w:val="en-IL"/>
+        </w:rPr>
+      </w:pPr>
+      <w:r>
+        <w:rPr>
+          <w:b/>
+          <w:bCs/>
+          <w:lang w:val="en-IL"/>
+        </w:rPr>
+        <w:t xml:space="preserve">1. </w:t>
+      </w:r>
+      <w:r>
+        <w:rPr>
+          <w:b/>
+          <w:bCs/>
+          <w:rtl/>
+          <w:lang w:val="en-IL"/>
+        </w:rPr>
+        <w:t>יצירת קובץ המאגר</w:t>
+      </w:r>
+      <w:r>
+        <w:rPr>
+          <w:b/>
+          <w:bCs/>
+          <w:lang w:val="en-IL"/>
+        </w:rPr>
+        <w:t xml:space="preserve"> (sources.txt)</w:t>
+      </w:r>
+    </w:p>
+    <w:p>
+      <w:pPr>
+        <w:bidi/>
+        <w:rPr>
+          <w:lang w:val="en-IL"/>
+        </w:rPr>
+      </w:pPr>
+      <w:r>
+        <w:rPr>
+          <w:rtl/>
+          <w:lang w:val="en-IL"/>
+        </w:rPr>
+        <w:t xml:space="preserve">צור קובץ בשם </w:t>
+      </w:r>
+      <w:r>
+        <w:rPr>
+          <w:rFonts w:hint="cs"/>
+          <w:rtl/>
+          <w:lang w:val="en-IL"/>
+        </w:rPr>
+        <w:t xml:space="preserve"> </w:t>
+      </w:r>
+      <w:r>
+        <w:rPr>
+          <w:lang w:val="en-US"/>
+        </w:rPr>
+        <w:t xml:space="preserve"> </w:t>
+      </w:r>
+      <w:r>
+        <w:rPr>
+          <w:lang w:val="en-IL"/>
+        </w:rPr>
+        <w:t xml:space="preserve">sources.txt </w:t>
+      </w:r>
+      <w:r>
+        <w:rPr>
+          <w:rtl/>
+          <w:lang w:val="en-IL"/>
+        </w:rPr>
+        <w:t>בתיקייה הראשית של הפרויקט. לתוכו פשוט תדביק את כל הטקסט הגולמי מה</w:t>
+      </w:r>
+      <w:r>
+        <w:rPr>
+          <w:lang w:val="en-IL"/>
+        </w:rPr>
+        <w:t>-</w:t>
+      </w:r>
+      <w:proofErr w:type="spellStart"/>
+      <w:r>
+        <w:rPr>
+          <w:lang w:val="en-IL"/>
+        </w:rPr>
+        <w:t>NotebookLM</w:t>
+      </w:r>
+      <w:proofErr w:type="spellEnd"/>
+      <w:r>
+        <w:rPr>
+          <w:lang w:val="en-IL"/>
+        </w:rPr>
+        <w:t xml:space="preserve">/YouTube </w:t>
+      </w:r>
+      <w:r>
+        <w:rPr>
+          <w:rtl/>
+          <w:lang w:val="en-IL"/>
+        </w:rPr>
+        <w:t>בכל פעם שמתחשק לך</w:t>
+      </w:r>
+      <w:r>
+        <w:rPr>
+          <w:lang w:val="en-IL"/>
+        </w:rPr>
+        <w:t>.</w:t>
+      </w:r>
+    </w:p>
+    <w:p>
+      <w:pPr>
+        <w:bidi/>
+        <w:rPr>
+          <w:b/>
+          <w:bCs/>
+          <w:lang w:val="en-IL"/>
+        </w:rPr>
+      </w:pPr>
+      <w:r>
+        <w:rPr>
+          <w:b/>
+          <w:bCs/>
+          <w:lang w:val="en-IL"/>
+        </w:rPr>
+        <w:t xml:space="preserve">2. </w:t>
+      </w:r>
+      <w:r>
+        <w:rPr>
+          <w:b/>
+          <w:bCs/>
+          <w:rtl/>
+          <w:lang w:val="en-IL"/>
+        </w:rPr>
+        <w:t>הפיכת השרת</w:t>
+      </w:r>
+      <w:r>
+        <w:rPr>
+          <w:b/>
+          <w:bCs/>
+          <w:lang w:val="en-IL"/>
+        </w:rPr>
+        <w:t xml:space="preserve"> (</w:t>
+      </w:r>
+      <w:proofErr w:type="spellStart"/>
+      <w:r>
+        <w:rPr>
+          <w:b/>
+          <w:bCs/>
+          <w:lang w:val="en-IL"/>
+        </w:rPr>
+        <w:t>api</w:t>
+      </w:r>
+      <w:proofErr w:type="spellEnd"/>
+      <w:r>
+        <w:rPr>
+          <w:b/>
+          <w:bCs/>
+          <w:lang w:val="en-IL"/>
+        </w:rPr>
+        <w:t xml:space="preserve">/server.js) </w:t>
+      </w:r>
+      <w:r>
+        <w:rPr>
+          <w:b/>
+          <w:bCs/>
+          <w:rtl/>
+          <w:lang w:val="en-IL"/>
+        </w:rPr>
+        <w:t>ל"מעבד חכם</w:t>
+      </w:r>
+      <w:r>
+        <w:rPr>
+          <w:b/>
+          <w:bCs/>
+          <w:lang w:val="en-IL"/>
+        </w:rPr>
+        <w:t>"</w:t>
+      </w:r>
+    </w:p>
+    <w:p>
+      <w:pPr>
+        <w:bidi/>
+        <w:rPr>
+          <w:lang w:val="en-IL"/>
+        </w:rPr>
+      </w:pPr>
+      <w:r>
+        <w:rPr>
+          <w:rtl/>
+          <w:lang w:val="en-IL"/>
+        </w:rPr>
+        <w:t>אנחנו נשנה את השרת כך שבכל פעם שמישהו פותח את האפליקציה, הוא יבצע את הפעולות הבאות</w:t>
+      </w:r>
+      <w:r>
+        <w:rPr>
+          <w:lang w:val="en-IL"/>
+        </w:rPr>
+        <w:t>:</w:t>
+      </w:r>
+    </w:p>
+    <w:p>
+      <w:pPr>
+        <w:numPr>
+          <w:ilvl w:val="0"/>
+          <w:numId w:val="12"/>
+        </w:numPr>
+        <w:bidi/>
+        <w:rPr>
+          <w:lang w:val="en-IL"/>
+        </w:rPr>
+      </w:pPr>
+      <w:r>
+        <w:rPr>
+          <w:rtl/>
+          <w:lang w:val="en-IL"/>
+        </w:rPr>
+        <w:t>יקרא את קובץ ה</w:t>
+      </w:r>
+      <w:r>
+        <w:rPr>
+          <w:lang w:val="en-IL"/>
+        </w:rPr>
+        <w:t>-sources.txt.</w:t>
+      </w:r>
+    </w:p>
+    <w:p>
+      <w:pPr>
+        <w:numPr>
+          <w:ilvl w:val="0"/>
+          <w:numId w:val="12"/>
+        </w:numPr>
+        <w:bidi/>
+        <w:rPr>
+          <w:lang w:val="en-IL"/>
+        </w:rPr>
+      </w:pPr>
+      <w:r>
+        <w:rPr>
+          <w:rtl/>
+          <w:lang w:val="en-IL"/>
+        </w:rPr>
+        <w:t>ישלח את הטקסט הגולמי ל</w:t>
+      </w:r>
+      <w:r>
+        <w:rPr>
+          <w:lang w:val="en-IL"/>
+        </w:rPr>
+        <w:t>-Gemini.</w:t>
+      </w:r>
+    </w:p>
+    <w:p>
+      <w:pPr>
+        <w:numPr>
+          <w:ilvl w:val="0"/>
+          <w:numId w:val="12"/>
+        </w:numPr>
+        <w:bidi/>
+        <w:rPr>
+          <w:lang w:val="en-IL"/>
+        </w:rPr>
+      </w:pPr>
+      <w:r>
+        <w:rPr>
+          <w:rtl/>
+          <w:lang w:val="en-IL"/>
+        </w:rPr>
+        <w:t>יבקש מה</w:t>
+      </w:r>
+      <w:r>
+        <w:rPr>
+          <w:lang w:val="en-IL"/>
+        </w:rPr>
+        <w:t xml:space="preserve">-AI </w:t>
+      </w:r>
+      <w:r>
+        <w:rPr>
+          <w:rtl/>
+          <w:lang w:val="en-IL"/>
+        </w:rPr>
+        <w:t>לבנות מתוך המאגר תפריט ל-7 ימים בפורמט</w:t>
+      </w:r>
+      <w:r>
+        <w:rPr>
+          <w:lang w:val="en-IL"/>
+        </w:rPr>
+        <w:t xml:space="preserve"> JSON.</w:t>
+      </w:r>
+    </w:p>
+    <w:p>
+      <w:pPr>
+        <w:numPr>
+          <w:ilvl w:val="0"/>
+          <w:numId w:val="12"/>
+        </w:numPr>
+        <w:bidi/>
+        <w:rPr>
+          <w:lang w:val="en-IL"/>
+        </w:rPr>
+      </w:pPr>
+      <w:r>
+        <w:rPr>
+          <w:rtl/>
+          <w:lang w:val="en-IL"/>
+        </w:rPr>
+        <w:t>ישלח את התוצאה ישר</w:t>
+      </w:r>
+      <w:r>
+        <w:rPr>
+          <w:rFonts w:hint="cs"/>
+          <w:rtl/>
+          <w:lang w:val="en-IL"/>
+        </w:rPr>
+        <w:t xml:space="preserve"> ל-  </w:t>
+      </w:r>
+      <w:r>
+        <w:rPr>
+          <w:lang w:val="en-IL"/>
+        </w:rPr>
+        <w:t>index.html.</w:t>
+      </w:r>
+    </w:p>
+    <w:p>
+      <w:pPr>
+        <w:bidi/>
+        <w:rPr>
+          <w:rFonts w:hint="cs"/>
+          <w:rtl/>
+          <w:lang w:val="en-IL"/>
+        </w:rPr>
+      </w:pPr>
+    </w:p>
+    <w:p>
+      <w:pPr>
+        <w:bidi/>
+        <w:rPr>
+          <w:rFonts w:hint="cs"/>
+          <w:rtl/>
+          <w:lang w:val="en-IL"/>
         </w:rPr>
       </w:pPr>
     </w:p>
@@ -6654,7 +9176,14 @@
         <w:rFonts w:hint="cs"/>
         <w:rtl/>
       </w:rPr>
-      <w:t xml:space="preserve">באמצעות </w:t>
+      <w:t xml:space="preserve">על בסיס ירקות </w:t>
+    </w:r>
+    <w:r>
+      <w:rPr>
+        <w:rFonts w:hint="cs"/>
+        <w:rtl/>
+      </w:rPr>
+      <w:t xml:space="preserve">דרך </w:t>
     </w:r>
     <w:r>
       <w:rPr>
@@ -6804,6 +9333,345 @@
     </w:lvl>
   </w:abstractNum>
   <w:abstractNum w:abstractNumId="1" w15:restartNumberingAfterBreak="0">
+    <w:nsid w:val="1E4E47EB"/>
+    <w:multiLevelType w:val="multilevel"/>
+    <w:tmpl w:val="7CFE9256"/>
+    <w:lvl w:ilvl="0">
+      <w:start w:val="1"/>
+      <w:numFmt w:val="decimal"/>
+      <w:lvlText w:val="%1."/>
+      <w:lvlJc w:val="left"/>
+      <w:pPr>
+        <w:tabs>
+          <w:tab w:val="num" w:pos="720"/>
+        </w:tabs>
+        <w:ind w:left="720" w:hanging="360"/>
+      </w:pPr>
+    </w:lvl>
+    <w:lvl w:ilvl="1" w:tentative="1">
+      <w:start w:val="1"/>
+      <w:numFmt w:val="decimal"/>
+      <w:lvlText w:val="%2."/>
+      <w:lvlJc w:val="left"/>
+      <w:pPr>
+        <w:tabs>
+          <w:tab w:val="num" w:pos="1440"/>
+        </w:tabs>
+        <w:ind w:left="1440" w:hanging="360"/>
+      </w:pPr>
+    </w:lvl>
+    <w:lvl w:ilvl="2" w:tentative="1">
+      <w:start w:val="1"/>
+      <w:numFmt w:val="decimal"/>
+      <w:lvlText w:val="%3."/>
+      <w:lvlJc w:val="left"/>
+      <w:pPr>
+        <w:tabs>
+          <w:tab w:val="num" w:pos="2160"/>
+        </w:tabs>
+        <w:ind w:left="2160" w:hanging="360"/>
+      </w:pPr>
+    </w:lvl>
+    <w:lvl w:ilvl="3" w:tentative="1">
+      <w:start w:val="1"/>
+      <w:numFmt w:val="decimal"/>
+      <w:lvlText w:val="%4."/>
+      <w:lvlJc w:val="left"/>
+      <w:pPr>
+        <w:tabs>
+          <w:tab w:val="num" w:pos="2880"/>
+        </w:tabs>
+        <w:ind w:left="2880" w:hanging="360"/>
+      </w:pPr>
+    </w:lvl>
+    <w:lvl w:ilvl="4" w:tentative="1">
+      <w:start w:val="1"/>
+      <w:numFmt w:val="decimal"/>
+      <w:lvlText w:val="%5."/>
+      <w:lvlJc w:val="left"/>
+      <w:pPr>
+        <w:tabs>
+          <w:tab w:val="num" w:pos="3600"/>
+        </w:tabs>
+        <w:ind w:left="3600" w:hanging="360"/>
+      </w:pPr>
+    </w:lvl>
+    <w:lvl w:ilvl="5" w:tentative="1">
+      <w:start w:val="1"/>
+      <w:numFmt w:val="decimal"/>
+      <w:lvlText w:val="%6."/>
+      <w:lvlJc w:val="left"/>
+      <w:pPr>
+        <w:tabs>
+          <w:tab w:val="num" w:pos="4320"/>
+        </w:tabs>
+        <w:ind w:left="4320" w:hanging="360"/>
+      </w:pPr>
+    </w:lvl>
+    <w:lvl w:ilvl="6" w:tentative="1">
+      <w:start w:val="1"/>
+      <w:numFmt w:val="decimal"/>
+      <w:lvlText w:val="%7."/>
+      <w:lvlJc w:val="left"/>
+      <w:pPr>
+        <w:tabs>
+          <w:tab w:val="num" w:pos="5040"/>
+        </w:tabs>
+        <w:ind w:left="5040" w:hanging="360"/>
+      </w:pPr>
+    </w:lvl>
+    <w:lvl w:ilvl="7" w:tentative="1">
+      <w:start w:val="1"/>
+      <w:numFmt w:val="decimal"/>
+      <w:lvlText w:val="%8."/>
+      <w:lvlJc w:val="left"/>
+      <w:pPr>
+        <w:tabs>
+          <w:tab w:val="num" w:pos="5760"/>
+        </w:tabs>
+        <w:ind w:left="5760" w:hanging="360"/>
+      </w:pPr>
+    </w:lvl>
+    <w:lvl w:ilvl="8" w:tentative="1">
+      <w:start w:val="1"/>
+      <w:numFmt w:val="decimal"/>
+      <w:lvlText w:val="%9."/>
+      <w:lvlJc w:val="left"/>
+      <w:pPr>
+        <w:tabs>
+          <w:tab w:val="num" w:pos="6480"/>
+        </w:tabs>
+        <w:ind w:left="6480" w:hanging="360"/>
+      </w:pPr>
+    </w:lvl>
+  </w:abstractNum>
+  <w:abstractNum w:abstractNumId="2" w15:restartNumberingAfterBreak="0">
+    <w:nsid w:val="2940285E"/>
+    <w:multiLevelType w:val="multilevel"/>
+    <w:tmpl w:val="CC1A787A"/>
+    <w:lvl w:ilvl="0">
+      <w:start w:val="1"/>
+      <w:numFmt w:val="decimal"/>
+      <w:lvlText w:val="%1."/>
+      <w:lvlJc w:val="left"/>
+      <w:pPr>
+        <w:tabs>
+          <w:tab w:val="num" w:pos="720"/>
+        </w:tabs>
+        <w:ind w:left="720" w:hanging="360"/>
+      </w:pPr>
+    </w:lvl>
+    <w:lvl w:ilvl="1" w:tentative="1">
+      <w:start w:val="1"/>
+      <w:numFmt w:val="decimal"/>
+      <w:lvlText w:val="%2."/>
+      <w:lvlJc w:val="left"/>
+      <w:pPr>
+        <w:tabs>
+          <w:tab w:val="num" w:pos="1440"/>
+        </w:tabs>
+        <w:ind w:left="1440" w:hanging="360"/>
+      </w:pPr>
+    </w:lvl>
+    <w:lvl w:ilvl="2" w:tentative="1">
+      <w:start w:val="1"/>
+      <w:numFmt w:val="decimal"/>
+      <w:lvlText w:val="%3."/>
+      <w:lvlJc w:val="left"/>
+      <w:pPr>
+        <w:tabs>
+          <w:tab w:val="num" w:pos="2160"/>
+        </w:tabs>
+        <w:ind w:left="2160" w:hanging="360"/>
+      </w:pPr>
+    </w:lvl>
+    <w:lvl w:ilvl="3" w:tentative="1">
+      <w:start w:val="1"/>
+      <w:numFmt w:val="decimal"/>
+      <w:lvlText w:val="%4."/>
+      <w:lvlJc w:val="left"/>
+      <w:pPr>
+        <w:tabs>
+          <w:tab w:val="num" w:pos="2880"/>
+        </w:tabs>
+        <w:ind w:left="2880" w:hanging="360"/>
+      </w:pPr>
+    </w:lvl>
+    <w:lvl w:ilvl="4" w:tentative="1">
+      <w:start w:val="1"/>
+      <w:numFmt w:val="decimal"/>
+      <w:lvlText w:val="%5."/>
+      <w:lvlJc w:val="left"/>
+      <w:pPr>
+        <w:tabs>
+          <w:tab w:val="num" w:pos="3600"/>
+        </w:tabs>
+        <w:ind w:left="3600" w:hanging="360"/>
+      </w:pPr>
+    </w:lvl>
+    <w:lvl w:ilvl="5" w:tentative="1">
+      <w:start w:val="1"/>
+      <w:numFmt w:val="decimal"/>
+      <w:lvlText w:val="%6."/>
+      <w:lvlJc w:val="left"/>
+      <w:pPr>
+        <w:tabs>
+          <w:tab w:val="num" w:pos="4320"/>
+        </w:tabs>
+        <w:ind w:left="4320" w:hanging="360"/>
+      </w:pPr>
+    </w:lvl>
+    <w:lvl w:ilvl="6" w:tentative="1">
+      <w:start w:val="1"/>
+      <w:numFmt w:val="decimal"/>
+      <w:lvlText w:val="%7."/>
+      <w:lvlJc w:val="left"/>
+      <w:pPr>
+        <w:tabs>
+          <w:tab w:val="num" w:pos="5040"/>
+        </w:tabs>
+        <w:ind w:left="5040" w:hanging="360"/>
+      </w:pPr>
+    </w:lvl>
+    <w:lvl w:ilvl="7" w:tentative="1">
+      <w:start w:val="1"/>
+      <w:numFmt w:val="decimal"/>
+      <w:lvlText w:val="%8."/>
+      <w:lvlJc w:val="left"/>
+      <w:pPr>
+        <w:tabs>
+          <w:tab w:val="num" w:pos="5760"/>
+        </w:tabs>
+        <w:ind w:left="5760" w:hanging="360"/>
+      </w:pPr>
+    </w:lvl>
+    <w:lvl w:ilvl="8" w:tentative="1">
+      <w:start w:val="1"/>
+      <w:numFmt w:val="decimal"/>
+      <w:lvlText w:val="%9."/>
+      <w:lvlJc w:val="left"/>
+      <w:pPr>
+        <w:tabs>
+          <w:tab w:val="num" w:pos="6480"/>
+        </w:tabs>
+        <w:ind w:left="6480" w:hanging="360"/>
+      </w:pPr>
+    </w:lvl>
+  </w:abstractNum>
+  <w:abstractNum w:abstractNumId="3" w15:restartNumberingAfterBreak="0">
+    <w:nsid w:val="36E06A2A"/>
+    <w:multiLevelType w:val="multilevel"/>
+    <w:tmpl w:val="5064613C"/>
+    <w:lvl w:ilvl="0">
+      <w:start w:val="1"/>
+      <w:numFmt w:val="decimal"/>
+      <w:lvlText w:val="%1."/>
+      <w:lvlJc w:val="left"/>
+      <w:pPr>
+        <w:tabs>
+          <w:tab w:val="num" w:pos="720"/>
+        </w:tabs>
+        <w:ind w:left="720" w:hanging="360"/>
+      </w:pPr>
+    </w:lvl>
+    <w:lvl w:ilvl="1" w:tentative="1">
+      <w:start w:val="1"/>
+      <w:numFmt w:val="decimal"/>
+      <w:lvlText w:val="%2."/>
+      <w:lvlJc w:val="left"/>
+      <w:pPr>
+        <w:tabs>
+          <w:tab w:val="num" w:pos="1440"/>
+        </w:tabs>
+        <w:ind w:left="1440" w:hanging="360"/>
+      </w:pPr>
+    </w:lvl>
+    <w:lvl w:ilvl="2" w:tentative="1">
+      <w:start w:val="1"/>
+      <w:numFmt w:val="decimal"/>
+      <w:lvlText w:val="%3."/>
+      <w:lvlJc w:val="left"/>
+      <w:pPr>
+        <w:tabs>
+          <w:tab w:val="num" w:pos="2160"/>
+        </w:tabs>
+        <w:ind w:left="2160" w:hanging="360"/>
+      </w:pPr>
+    </w:lvl>
+    <w:lvl w:ilvl="3" w:tentative="1">
+      <w:start w:val="1"/>
+      <w:numFmt w:val="decimal"/>
+      <w:lvlText w:val="%4."/>
+      <w:lvlJc w:val="left"/>
+      <w:pPr>
+        <w:tabs>
+          <w:tab w:val="num" w:pos="2880"/>
+        </w:tabs>
+        <w:ind w:left="2880" w:hanging="360"/>
+      </w:pPr>
+    </w:lvl>
+    <w:lvl w:ilvl="4" w:tentative="1">
+      <w:start w:val="1"/>
+      <w:numFmt w:val="decimal"/>
+      <w:lvlText w:val="%5."/>
+      <w:lvlJc w:val="left"/>
+      <w:pPr>
+        <w:tabs>
+          <w:tab w:val="num" w:pos="3600"/>
+        </w:tabs>
+        <w:ind w:left="3600" w:hanging="360"/>
+      </w:pPr>
+    </w:lvl>
+    <w:lvl w:ilvl="5" w:tentative="1">
+      <w:start w:val="1"/>
+      <w:numFmt w:val="decimal"/>
+      <w:lvlText w:val="%6."/>
+      <w:lvlJc w:val="left"/>
+      <w:pPr>
+        <w:tabs>
+          <w:tab w:val="num" w:pos="4320"/>
+        </w:tabs>
+        <w:ind w:left="4320" w:hanging="360"/>
+      </w:pPr>
+    </w:lvl>
+    <w:lvl w:ilvl="6" w:tentative="1">
+      <w:start w:val="1"/>
+      <w:numFmt w:val="decimal"/>
+      <w:lvlText w:val="%7."/>
+      <w:lvlJc w:val="left"/>
+      <w:pPr>
+        <w:tabs>
+          <w:tab w:val="num" w:pos="5040"/>
+        </w:tabs>
+        <w:ind w:left="5040" w:hanging="360"/>
+      </w:pPr>
+    </w:lvl>
+    <w:lvl w:ilvl="7" w:tentative="1">
+      <w:start w:val="1"/>
+      <w:numFmt w:val="decimal"/>
+      <w:lvlText w:val="%8."/>
+      <w:lvlJc w:val="left"/>
+      <w:pPr>
+        <w:tabs>
+          <w:tab w:val="num" w:pos="5760"/>
+        </w:tabs>
+        <w:ind w:left="5760" w:hanging="360"/>
+      </w:pPr>
+    </w:lvl>
+    <w:lvl w:ilvl="8" w:tentative="1">
+      <w:start w:val="1"/>
+      <w:numFmt w:val="decimal"/>
+      <w:lvlText w:val="%9."/>
+      <w:lvlJc w:val="left"/>
+      <w:pPr>
+        <w:tabs>
+          <w:tab w:val="num" w:pos="6480"/>
+        </w:tabs>
+        <w:ind w:left="6480" w:hanging="360"/>
+      </w:pPr>
+    </w:lvl>
+  </w:abstractNum>
+  <w:abstractNum w:abstractNumId="4" w15:restartNumberingAfterBreak="0">
     <w:nsid w:val="3A0D4011"/>
     <w:multiLevelType w:val="multilevel"/>
     <w:tmpl w:val="00BEE326"/>
@@ -6916,7 +9784,7 @@
       </w:pPr>
     </w:lvl>
   </w:abstractNum>
-  <w:abstractNum w:abstractNumId="2" w15:restartNumberingAfterBreak="0">
+  <w:abstractNum w:abstractNumId="5" w15:restartNumberingAfterBreak="0">
     <w:nsid w:val="44D726D1"/>
     <w:multiLevelType w:val="multilevel"/>
     <w:tmpl w:val="AF68C89E"/>
@@ -7029,7 +9897,233 @@
       </w:pPr>
     </w:lvl>
   </w:abstractNum>
-  <w:abstractNum w:abstractNumId="3" w15:restartNumberingAfterBreak="0">
+  <w:abstractNum w:abstractNumId="6" w15:restartNumberingAfterBreak="0">
+    <w:nsid w:val="45E65069"/>
+    <w:multiLevelType w:val="multilevel"/>
+    <w:tmpl w:val="FF146662"/>
+    <w:lvl w:ilvl="0">
+      <w:start w:val="1"/>
+      <w:numFmt w:val="decimal"/>
+      <w:lvlText w:val="%1."/>
+      <w:lvlJc w:val="left"/>
+      <w:pPr>
+        <w:tabs>
+          <w:tab w:val="num" w:pos="720"/>
+        </w:tabs>
+        <w:ind w:left="720" w:hanging="360"/>
+      </w:pPr>
+    </w:lvl>
+    <w:lvl w:ilvl="1" w:tentative="1">
+      <w:start w:val="1"/>
+      <w:numFmt w:val="decimal"/>
+      <w:lvlText w:val="%2."/>
+      <w:lvlJc w:val="left"/>
+      <w:pPr>
+        <w:tabs>
+          <w:tab w:val="num" w:pos="1440"/>
+        </w:tabs>
+        <w:ind w:left="1440" w:hanging="360"/>
+      </w:pPr>
+    </w:lvl>
+    <w:lvl w:ilvl="2" w:tentative="1">
+      <w:start w:val="1"/>
+      <w:numFmt w:val="decimal"/>
+      <w:lvlText w:val="%3."/>
+      <w:lvlJc w:val="left"/>
+      <w:pPr>
+        <w:tabs>
+          <w:tab w:val="num" w:pos="2160"/>
+        </w:tabs>
+        <w:ind w:left="2160" w:hanging="360"/>
+      </w:pPr>
+    </w:lvl>
+    <w:lvl w:ilvl="3" w:tentative="1">
+      <w:start w:val="1"/>
+      <w:numFmt w:val="decimal"/>
+      <w:lvlText w:val="%4."/>
+      <w:lvlJc w:val="left"/>
+      <w:pPr>
+        <w:tabs>
+          <w:tab w:val="num" w:pos="2880"/>
+        </w:tabs>
+        <w:ind w:left="2880" w:hanging="360"/>
+      </w:pPr>
+    </w:lvl>
+    <w:lvl w:ilvl="4" w:tentative="1">
+      <w:start w:val="1"/>
+      <w:numFmt w:val="decimal"/>
+      <w:lvlText w:val="%5."/>
+      <w:lvlJc w:val="left"/>
+      <w:pPr>
+        <w:tabs>
+          <w:tab w:val="num" w:pos="3600"/>
+        </w:tabs>
+        <w:ind w:left="3600" w:hanging="360"/>
+      </w:pPr>
+    </w:lvl>
+    <w:lvl w:ilvl="5" w:tentative="1">
+      <w:start w:val="1"/>
+      <w:numFmt w:val="decimal"/>
+      <w:lvlText w:val="%6."/>
+      <w:lvlJc w:val="left"/>
+      <w:pPr>
+        <w:tabs>
+          <w:tab w:val="num" w:pos="4320"/>
+        </w:tabs>
+        <w:ind w:left="4320" w:hanging="360"/>
+      </w:pPr>
+    </w:lvl>
+    <w:lvl w:ilvl="6" w:tentative="1">
+      <w:start w:val="1"/>
+      <w:numFmt w:val="decimal"/>
+      <w:lvlText w:val="%7."/>
+      <w:lvlJc w:val="left"/>
+      <w:pPr>
+        <w:tabs>
+          <w:tab w:val="num" w:pos="5040"/>
+        </w:tabs>
+        <w:ind w:left="5040" w:hanging="360"/>
+      </w:pPr>
+    </w:lvl>
+    <w:lvl w:ilvl="7" w:tentative="1">
+      <w:start w:val="1"/>
+      <w:numFmt w:val="decimal"/>
+      <w:lvlText w:val="%8."/>
+      <w:lvlJc w:val="left"/>
+      <w:pPr>
+        <w:tabs>
+          <w:tab w:val="num" w:pos="5760"/>
+        </w:tabs>
+        <w:ind w:left="5760" w:hanging="360"/>
+      </w:pPr>
+    </w:lvl>
+    <w:lvl w:ilvl="8" w:tentative="1">
+      <w:start w:val="1"/>
+      <w:numFmt w:val="decimal"/>
+      <w:lvlText w:val="%9."/>
+      <w:lvlJc w:val="left"/>
+      <w:pPr>
+        <w:tabs>
+          <w:tab w:val="num" w:pos="6480"/>
+        </w:tabs>
+        <w:ind w:left="6480" w:hanging="360"/>
+      </w:pPr>
+    </w:lvl>
+  </w:abstractNum>
+  <w:abstractNum w:abstractNumId="7" w15:restartNumberingAfterBreak="0">
+    <w:nsid w:val="543542E5"/>
+    <w:multiLevelType w:val="multilevel"/>
+    <w:tmpl w:val="298E8B40"/>
+    <w:lvl w:ilvl="0">
+      <w:start w:val="1"/>
+      <w:numFmt w:val="decimal"/>
+      <w:lvlText w:val="%1."/>
+      <w:lvlJc w:val="left"/>
+      <w:pPr>
+        <w:tabs>
+          <w:tab w:val="num" w:pos="720"/>
+        </w:tabs>
+        <w:ind w:left="720" w:hanging="360"/>
+      </w:pPr>
+    </w:lvl>
+    <w:lvl w:ilvl="1" w:tentative="1">
+      <w:start w:val="1"/>
+      <w:numFmt w:val="decimal"/>
+      <w:lvlText w:val="%2."/>
+      <w:lvlJc w:val="left"/>
+      <w:pPr>
+        <w:tabs>
+          <w:tab w:val="num" w:pos="1440"/>
+        </w:tabs>
+        <w:ind w:left="1440" w:hanging="360"/>
+      </w:pPr>
+    </w:lvl>
+    <w:lvl w:ilvl="2" w:tentative="1">
+      <w:start w:val="1"/>
+      <w:numFmt w:val="decimal"/>
+      <w:lvlText w:val="%3."/>
+      <w:lvlJc w:val="left"/>
+      <w:pPr>
+        <w:tabs>
+          <w:tab w:val="num" w:pos="2160"/>
+        </w:tabs>
+        <w:ind w:left="2160" w:hanging="360"/>
+      </w:pPr>
+    </w:lvl>
+    <w:lvl w:ilvl="3" w:tentative="1">
+      <w:start w:val="1"/>
+      <w:numFmt w:val="decimal"/>
+      <w:lvlText w:val="%4."/>
+      <w:lvlJc w:val="left"/>
+      <w:pPr>
+        <w:tabs>
+          <w:tab w:val="num" w:pos="2880"/>
+        </w:tabs>
+        <w:ind w:left="2880" w:hanging="360"/>
+      </w:pPr>
+    </w:lvl>
+    <w:lvl w:ilvl="4" w:tentative="1">
+      <w:start w:val="1"/>
+      <w:numFmt w:val="decimal"/>
+      <w:lvlText w:val="%5."/>
+      <w:lvlJc w:val="left"/>
+      <w:pPr>
+        <w:tabs>
+          <w:tab w:val="num" w:pos="3600"/>
+        </w:tabs>
+        <w:ind w:left="3600" w:hanging="360"/>
+      </w:pPr>
+    </w:lvl>
+    <w:lvl w:ilvl="5" w:tentative="1">
+      <w:start w:val="1"/>
+      <w:numFmt w:val="decimal"/>
+      <w:lvlText w:val="%6."/>
+      <w:lvlJc w:val="left"/>
+      <w:pPr>
+        <w:tabs>
+          <w:tab w:val="num" w:pos="4320"/>
+        </w:tabs>
+        <w:ind w:left="4320" w:hanging="360"/>
+      </w:pPr>
+    </w:lvl>
+    <w:lvl w:ilvl="6" w:tentative="1">
+      <w:start w:val="1"/>
+      <w:numFmt w:val="decimal"/>
+      <w:lvlText w:val="%7."/>
+      <w:lvlJc w:val="left"/>
+      <w:pPr>
+        <w:tabs>
+          <w:tab w:val="num" w:pos="5040"/>
+        </w:tabs>
+        <w:ind w:left="5040" w:hanging="360"/>
+      </w:pPr>
+    </w:lvl>
+    <w:lvl w:ilvl="7" w:tentative="1">
+      <w:start w:val="1"/>
+      <w:numFmt w:val="decimal"/>
+      <w:lvlText w:val="%8."/>
+      <w:lvlJc w:val="left"/>
+      <w:pPr>
+        <w:tabs>
+          <w:tab w:val="num" w:pos="5760"/>
+        </w:tabs>
+        <w:ind w:left="5760" w:hanging="360"/>
+      </w:pPr>
+    </w:lvl>
+    <w:lvl w:ilvl="8" w:tentative="1">
+      <w:start w:val="1"/>
+      <w:numFmt w:val="decimal"/>
+      <w:lvlText w:val="%9."/>
+      <w:lvlJc w:val="left"/>
+      <w:pPr>
+        <w:tabs>
+          <w:tab w:val="num" w:pos="6480"/>
+        </w:tabs>
+        <w:ind w:left="6480" w:hanging="360"/>
+      </w:pPr>
+    </w:lvl>
+  </w:abstractNum>
+  <w:abstractNum w:abstractNumId="8" w15:restartNumberingAfterBreak="0">
     <w:nsid w:val="56DE3DF9"/>
     <w:multiLevelType w:val="multilevel"/>
     <w:tmpl w:val="6AD85686"/>
@@ -7146,7 +10240,124 @@
       </w:pPr>
     </w:lvl>
   </w:abstractNum>
-  <w:abstractNum w:abstractNumId="4" w15:restartNumberingAfterBreak="0">
+  <w:abstractNum w:abstractNumId="9" w15:restartNumberingAfterBreak="0">
+    <w:nsid w:val="5912430D"/>
+    <w:multiLevelType w:val="multilevel"/>
+    <w:tmpl w:val="358814EE"/>
+    <w:lvl w:ilvl="0">
+      <w:start w:val="1"/>
+      <w:numFmt w:val="decimal"/>
+      <w:lvlText w:val="%1."/>
+      <w:lvlJc w:val="left"/>
+      <w:pPr>
+        <w:tabs>
+          <w:tab w:val="num" w:pos="720"/>
+        </w:tabs>
+        <w:ind w:left="720" w:hanging="360"/>
+      </w:pPr>
+    </w:lvl>
+    <w:lvl w:ilvl="1">
+      <w:start w:val="1"/>
+      <w:numFmt w:val="bullet"/>
+      <w:lvlText w:val="o"/>
+      <w:lvlJc w:val="left"/>
+      <w:pPr>
+        <w:tabs>
+          <w:tab w:val="num" w:pos="1440"/>
+        </w:tabs>
+        <w:ind w:left="1440" w:hanging="360"/>
+      </w:pPr>
+      <w:rPr>
+        <w:rFonts w:ascii="Courier New" w:hAnsi="Courier New" w:hint="default"/>
+        <w:sz w:val="20"/>
+      </w:rPr>
+    </w:lvl>
+    <w:lvl w:ilvl="2" w:tentative="1">
+      <w:start w:val="1"/>
+      <w:numFmt w:val="decimal"/>
+      <w:lvlText w:val="%3."/>
+      <w:lvlJc w:val="left"/>
+      <w:pPr>
+        <w:tabs>
+          <w:tab w:val="num" w:pos="2160"/>
+        </w:tabs>
+        <w:ind w:left="2160" w:hanging="360"/>
+      </w:pPr>
+    </w:lvl>
+    <w:lvl w:ilvl="3" w:tentative="1">
+      <w:start w:val="1"/>
+      <w:numFmt w:val="decimal"/>
+      <w:lvlText w:val="%4."/>
+      <w:lvlJc w:val="left"/>
+      <w:pPr>
+        <w:tabs>
+          <w:tab w:val="num" w:pos="2880"/>
+        </w:tabs>
+        <w:ind w:left="2880" w:hanging="360"/>
+      </w:pPr>
+    </w:lvl>
+    <w:lvl w:ilvl="4" w:tentative="1">
+      <w:start w:val="1"/>
+      <w:numFmt w:val="decimal"/>
+      <w:lvlText w:val="%5."/>
+      <w:lvlJc w:val="left"/>
+      <w:pPr>
+        <w:tabs>
+          <w:tab w:val="num" w:pos="3600"/>
+        </w:tabs>
+        <w:ind w:left="3600" w:hanging="360"/>
+      </w:pPr>
+    </w:lvl>
+    <w:lvl w:ilvl="5" w:tentative="1">
+      <w:start w:val="1"/>
+      <w:numFmt w:val="decimal"/>
+      <w:lvlText w:val="%6."/>
+      <w:lvlJc w:val="left"/>
+      <w:pPr>
+        <w:tabs>
+          <w:tab w:val="num" w:pos="4320"/>
+        </w:tabs>
+        <w:ind w:left="4320" w:hanging="360"/>
+      </w:pPr>
+    </w:lvl>
+    <w:lvl w:ilvl="6" w:tentative="1">
+      <w:start w:val="1"/>
+      <w:numFmt w:val="decimal"/>
+      <w:lvlText w:val="%7."/>
+      <w:lvlJc w:val="left"/>
+      <w:pPr>
+        <w:tabs>
+          <w:tab w:val="num" w:pos="5040"/>
+        </w:tabs>
+        <w:ind w:left="5040" w:hanging="360"/>
+      </w:pPr>
+    </w:lvl>
+    <w:lvl w:ilvl="7" w:tentative="1">
+      <w:start w:val="1"/>
+      <w:numFmt w:val="decimal"/>
+      <w:lvlText w:val="%8."/>
+      <w:lvlJc w:val="left"/>
+      <w:pPr>
+        <w:tabs>
+          <w:tab w:val="num" w:pos="5760"/>
+        </w:tabs>
+        <w:ind w:left="5760" w:hanging="360"/>
+      </w:pPr>
+    </w:lvl>
+    <w:lvl w:ilvl="8" w:tentative="1">
+      <w:start w:val="1"/>
+      <w:numFmt w:val="decimal"/>
+      <w:lvlText w:val="%9."/>
+      <w:lvlJc w:val="left"/>
+      <w:pPr>
+        <w:tabs>
+          <w:tab w:val="num" w:pos="6480"/>
+        </w:tabs>
+        <w:ind w:left="6480" w:hanging="360"/>
+      </w:pPr>
+    </w:lvl>
+  </w:abstractNum>
+  <w:abstractNum w:abstractNumId="10" w15:restartNumberingAfterBreak="0">
     <w:nsid w:val="766F6041"/>
     <w:multiLevelType w:val="multilevel"/>
     <w:tmpl w:val="C5921114"/>
@@ -7259,7 +10470,7 @@
       </w:pPr>
     </w:lvl>
   </w:abstractNum>
-  <w:abstractNum w:abstractNumId="5" w15:restartNumberingAfterBreak="0">
+  <w:abstractNum w:abstractNumId="11" w15:restartNumberingAfterBreak="0">
     <w:nsid w:val="77D91139"/>
     <w:multiLevelType w:val="multilevel"/>
     <w:tmpl w:val="C06460B8"/>
@@ -7409,22 +10620,40 @@
     </w:lvl>
   </w:abstractNum>
   <w:num w:numId="1" w16cid:durableId="2033677007">
-    <w:abstractNumId w:val="5"/>
+    <w:abstractNumId w:val="11"/>
   </w:num>
   <w:num w:numId="2" w16cid:durableId="1977374904">
-    <w:abstractNumId w:val="1"/>
+    <w:abstractNumId w:val="4"/>
   </w:num>
   <w:num w:numId="3" w16cid:durableId="1922789081">
     <w:abstractNumId w:val="0"/>
   </w:num>
   <w:num w:numId="4" w16cid:durableId="1903633565">
+    <w:abstractNumId w:val="5"/>
+  </w:num>
+  <w:num w:numId="5" w16cid:durableId="1750736376">
+    <w:abstractNumId w:val="8"/>
+  </w:num>
+  <w:num w:numId="6" w16cid:durableId="1368722082">
+    <w:abstractNumId w:val="10"/>
+  </w:num>
+  <w:num w:numId="7" w16cid:durableId="970017668">
+    <w:abstractNumId w:val="1"/>
+  </w:num>
+  <w:num w:numId="8" w16cid:durableId="497425528">
+    <w:abstractNumId w:val="9"/>
+  </w:num>
+  <w:num w:numId="9" w16cid:durableId="630671812">
+    <w:abstractNumId w:val="6"/>
+  </w:num>
+  <w:num w:numId="10" w16cid:durableId="525292758">
     <w:abstractNumId w:val="2"/>
   </w:num>
-  <w:num w:numId="5" w16cid:durableId="1750736376">
+  <w:num w:numId="11" w16cid:durableId="1553075069">
+    <w:abstractNumId w:val="7"/>
+  </w:num>
+  <w:num w:numId="12" w16cid:durableId="1440292907">
     <w:abstractNumId w:val="3"/>
-  </w:num>
-  <w:num w:numId="6" w16cid:durableId="1368722082">
-    <w:abstractNumId w:val="4"/>
   </w:num>
 </w:numbering>
 </file>

</xml_diff>